<commit_message>
Updated T1 P1 Readiness Packages
</commit_message>
<xml_diff>
--- a/docs/BELFOR_Readiness_Execution.docx
+++ b/docs/BELFOR_Readiness_Execution.docx
@@ -2770,661 +2770,6 @@
     </w:p>
     <w:p>
       <w:pPr>
-        <w:spacing w:before="180" w:after="80"/>
-      </w:pPr>
-      <w:r>
-        <w:rPr>
-          <w:b/>
-          <w:bCs/>
-          <w:color w:val="1A2B3C"/>
-          <w:sz w:val="22"/>
-          <w:szCs w:val="22"/>
-        </w:rPr>
-        <w:t>How we got to this tech count</w:t>
-      </w:r>
-    </w:p>
-    <w:tbl>
-      <w:tblPr>
-        <w:tblW w:w="10080" w:type="dxa"/>
-        <w:tblBorders>
-          <w:top w:val="single" w:sz="6" w:space="0" w:color="E8D89C"/>
-          <w:left w:val="single" w:sz="6" w:space="0" w:color="E8D89C"/>
-          <w:bottom w:val="single" w:sz="6" w:space="0" w:color="E8D89C"/>
-          <w:right w:val="single" w:sz="6" w:space="0" w:color="E8D89C"/>
-          <w:insideH w:val="single" w:sz="4" w:space="0" w:color="auto"/>
-          <w:insideV w:val="single" w:sz="4" w:space="0" w:color="auto"/>
-        </w:tblBorders>
-        <w:tblCellMar>
-          <w:left w:w="10" w:type="dxa"/>
-          <w:right w:w="10" w:type="dxa"/>
-        </w:tblCellMar>
-        <w:tblLook w:val="0000" w:firstRow="0" w:lastRow="0" w:firstColumn="0" w:lastColumn="0" w:noHBand="0" w:noVBand="0"/>
-      </w:tblPr>
-      <w:tblGrid>
-        <w:gridCol w:w="10080"/>
-      </w:tblGrid>
-      <w:tr>
-        <w:tblPrEx>
-          <w:tblCellMar>
-            <w:top w:w="0" w:type="dxa"/>
-            <w:bottom w:w="0" w:type="dxa"/>
-          </w:tblCellMar>
-        </w:tblPrEx>
-        <w:tc>
-          <w:tcPr>
-            <w:tcW w:w="10080" w:type="dxa"/>
-            <w:shd w:val="clear" w:color="auto" w:fill="FBF4E0"/>
-            <w:tcMar>
-              <w:top w:w="200" w:type="dxa"/>
-              <w:left w:w="280" w:type="dxa"/>
-              <w:bottom w:w="200" w:type="dxa"/>
-              <w:right w:w="280" w:type="dxa"/>
-            </w:tcMar>
-          </w:tcPr>
-          <w:p>
-            <w:pPr>
-              <w:spacing w:after="100"/>
-            </w:pPr>
-            <w:r>
-              <w:rPr>
-                <w:b/>
-                <w:bCs/>
-                <w:color w:val="1A2B3C"/>
-                <w:sz w:val="22"/>
-                <w:szCs w:val="22"/>
-              </w:rPr>
-              <w:t>Honest framing — the math behind the headline</w:t>
-            </w:r>
-          </w:p>
-          <w:p>
-            <w:r>
-              <w:rPr>
-                <w:color w:val="3A4A5C"/>
-              </w:rPr>
-              <w:t>BELFOR's 9,250 figure is the systemwide tech count published by BELFOR Franchise Group. This is verified at the holding-company level. What's harder to validate is the per-brand split — HOODZ and DUCTZ are commercial cleaning/restoration with smaller per-franchisee tech counts than BELFOR's restoration brands. The 94% ServiceBridge penetration in HOODZ/DUCTZ is the working number — that's a concrete, defensible reference. For franchisor-mandate ROI math, we use the full 9,250 as the addressable network and apply realistic conversion rates by brand vertical.</w:t>
-            </w:r>
-          </w:p>
-        </w:tc>
-      </w:tr>
-    </w:tbl>
-    <w:p>
-      <w:pPr>
-        <w:spacing w:before="80" w:after="80"/>
-      </w:pPr>
-    </w:p>
-    <w:p>
-      <w:pPr>
-        <w:spacing w:after="120"/>
-      </w:pPr>
-      <w:r>
-        <w:rPr>
-          <w:color w:val="3A4A5C"/>
-        </w:rPr>
-        <w:t>Range and corresponding Year 1 ARR @ 10% baseline / @ 25% stretch:</w:t>
-      </w:r>
-    </w:p>
-    <w:tbl>
-      <w:tblPr>
-        <w:tblW w:w="10080" w:type="dxa"/>
-        <w:tblBorders>
-          <w:top w:val="single" w:sz="4" w:space="0" w:color="auto"/>
-          <w:left w:val="single" w:sz="4" w:space="0" w:color="auto"/>
-          <w:bottom w:val="single" w:sz="4" w:space="0" w:color="auto"/>
-          <w:right w:val="single" w:sz="4" w:space="0" w:color="auto"/>
-          <w:insideH w:val="single" w:sz="4" w:space="0" w:color="auto"/>
-          <w:insideV w:val="single" w:sz="4" w:space="0" w:color="auto"/>
-        </w:tblBorders>
-        <w:tblCellMar>
-          <w:left w:w="10" w:type="dxa"/>
-          <w:right w:w="10" w:type="dxa"/>
-        </w:tblCellMar>
-        <w:tblLook w:val="0000" w:firstRow="0" w:lastRow="0" w:firstColumn="0" w:lastColumn="0" w:noHBand="0" w:noVBand="0"/>
-      </w:tblPr>
-      <w:tblGrid>
-        <w:gridCol w:w="3000"/>
-        <w:gridCol w:w="2200"/>
-        <w:gridCol w:w="2440"/>
-        <w:gridCol w:w="2440"/>
-      </w:tblGrid>
-      <w:tr>
-        <w:tblPrEx>
-          <w:tblCellMar>
-            <w:top w:w="0" w:type="dxa"/>
-            <w:bottom w:w="0" w:type="dxa"/>
-          </w:tblCellMar>
-        </w:tblPrEx>
-        <w:trPr>
-          <w:tblHeader/>
-        </w:trPr>
-        <w:tc>
-          <w:tcPr>
-            <w:tcW w:w="3000" w:type="dxa"/>
-            <w:tcBorders>
-              <w:top w:val="single" w:sz="4" w:space="0" w:color="1A2B3C"/>
-              <w:left w:val="single" w:sz="4" w:space="0" w:color="1A2B3C"/>
-              <w:bottom w:val="single" w:sz="4" w:space="0" w:color="1A2B3C"/>
-              <w:right w:val="single" w:sz="4" w:space="0" w:color="1A2B3C"/>
-            </w:tcBorders>
-            <w:shd w:val="clear" w:color="auto" w:fill="1A2B3C"/>
-            <w:tcMar>
-              <w:top w:w="100" w:type="dxa"/>
-              <w:left w:w="120" w:type="dxa"/>
-              <w:bottom w:w="100" w:type="dxa"/>
-              <w:right w:w="120" w:type="dxa"/>
-            </w:tcMar>
-            <w:vAlign w:val="center"/>
-          </w:tcPr>
-          <w:p>
-            <w:r>
-              <w:rPr>
-                <w:b/>
-                <w:bCs/>
-                <w:color w:val="FFFFFF"/>
-                <w:spacing w:val="30"/>
-                <w:sz w:val="16"/>
-                <w:szCs w:val="16"/>
-              </w:rPr>
-              <w:t>Scenario</w:t>
-            </w:r>
-          </w:p>
-        </w:tc>
-        <w:tc>
-          <w:tcPr>
-            <w:tcW w:w="2200" w:type="dxa"/>
-            <w:tcBorders>
-              <w:top w:val="single" w:sz="4" w:space="0" w:color="1A2B3C"/>
-              <w:left w:val="single" w:sz="4" w:space="0" w:color="1A2B3C"/>
-              <w:bottom w:val="single" w:sz="4" w:space="0" w:color="1A2B3C"/>
-              <w:right w:val="single" w:sz="4" w:space="0" w:color="1A2B3C"/>
-            </w:tcBorders>
-            <w:shd w:val="clear" w:color="auto" w:fill="1A2B3C"/>
-            <w:tcMar>
-              <w:top w:w="100" w:type="dxa"/>
-              <w:left w:w="120" w:type="dxa"/>
-              <w:bottom w:w="100" w:type="dxa"/>
-              <w:right w:w="120" w:type="dxa"/>
-            </w:tcMar>
-            <w:vAlign w:val="center"/>
-          </w:tcPr>
-          <w:p>
-            <w:r>
-              <w:rPr>
-                <w:b/>
-                <w:bCs/>
-                <w:color w:val="FFFFFF"/>
-                <w:spacing w:val="30"/>
-                <w:sz w:val="16"/>
-                <w:szCs w:val="16"/>
-              </w:rPr>
-              <w:t>Tech count</w:t>
-            </w:r>
-          </w:p>
-        </w:tc>
-        <w:tc>
-          <w:tcPr>
-            <w:tcW w:w="2440" w:type="dxa"/>
-            <w:tcBorders>
-              <w:top w:val="single" w:sz="4" w:space="0" w:color="1A2B3C"/>
-              <w:left w:val="single" w:sz="4" w:space="0" w:color="1A2B3C"/>
-              <w:bottom w:val="single" w:sz="4" w:space="0" w:color="1A2B3C"/>
-              <w:right w:val="single" w:sz="4" w:space="0" w:color="1A2B3C"/>
-            </w:tcBorders>
-            <w:shd w:val="clear" w:color="auto" w:fill="1A2B3C"/>
-            <w:tcMar>
-              <w:top w:w="100" w:type="dxa"/>
-              <w:left w:w="120" w:type="dxa"/>
-              <w:bottom w:w="100" w:type="dxa"/>
-              <w:right w:w="120" w:type="dxa"/>
-            </w:tcMar>
-            <w:vAlign w:val="center"/>
-          </w:tcPr>
-          <w:p>
-            <w:r>
-              <w:rPr>
-                <w:b/>
-                <w:bCs/>
-                <w:color w:val="FFFFFF"/>
-                <w:spacing w:val="30"/>
-                <w:sz w:val="16"/>
-                <w:szCs w:val="16"/>
-              </w:rPr>
-              <w:t>Y1 ARR @ 10%</w:t>
-            </w:r>
-          </w:p>
-        </w:tc>
-        <w:tc>
-          <w:tcPr>
-            <w:tcW w:w="2440" w:type="dxa"/>
-            <w:tcBorders>
-              <w:top w:val="single" w:sz="4" w:space="0" w:color="1A2B3C"/>
-              <w:left w:val="single" w:sz="4" w:space="0" w:color="1A2B3C"/>
-              <w:bottom w:val="single" w:sz="4" w:space="0" w:color="1A2B3C"/>
-              <w:right w:val="single" w:sz="4" w:space="0" w:color="1A2B3C"/>
-            </w:tcBorders>
-            <w:shd w:val="clear" w:color="auto" w:fill="1A2B3C"/>
-            <w:tcMar>
-              <w:top w:w="100" w:type="dxa"/>
-              <w:left w:w="120" w:type="dxa"/>
-              <w:bottom w:w="100" w:type="dxa"/>
-              <w:right w:w="120" w:type="dxa"/>
-            </w:tcMar>
-            <w:vAlign w:val="center"/>
-          </w:tcPr>
-          <w:p>
-            <w:r>
-              <w:rPr>
-                <w:b/>
-                <w:bCs/>
-                <w:color w:val="FFFFFF"/>
-                <w:spacing w:val="30"/>
-                <w:sz w:val="16"/>
-                <w:szCs w:val="16"/>
-              </w:rPr>
-              <w:t>Y1 ARR @ 25%</w:t>
-            </w:r>
-          </w:p>
-        </w:tc>
-      </w:tr>
-      <w:tr>
-        <w:tblPrEx>
-          <w:tblCellMar>
-            <w:top w:w="0" w:type="dxa"/>
-            <w:bottom w:w="0" w:type="dxa"/>
-          </w:tblCellMar>
-        </w:tblPrEx>
-        <w:trPr>
-          <w:cantSplit/>
-        </w:trPr>
-        <w:tc>
-          <w:tcPr>
-            <w:tcW w:w="3000" w:type="dxa"/>
-            <w:tcBorders>
-              <w:top w:val="single" w:sz="4" w:space="0" w:color="D0D5DD"/>
-              <w:left w:val="single" w:sz="4" w:space="0" w:color="D0D5DD"/>
-              <w:bottom w:val="single" w:sz="4" w:space="0" w:color="D0D5DD"/>
-              <w:right w:val="single" w:sz="4" w:space="0" w:color="D0D5DD"/>
-            </w:tcBorders>
-            <w:shd w:val="clear" w:color="auto" w:fill="FFFFFF"/>
-            <w:tcMar>
-              <w:top w:w="100" w:type="dxa"/>
-              <w:left w:w="120" w:type="dxa"/>
-              <w:bottom w:w="100" w:type="dxa"/>
-              <w:right w:w="120" w:type="dxa"/>
-            </w:tcMar>
-            <w:vAlign w:val="center"/>
-          </w:tcPr>
-          <w:p>
-            <w:r>
-              <w:rPr>
-                <w:color w:val="3A4A5C"/>
-                <w:sz w:val="17"/>
-                <w:szCs w:val="17"/>
-              </w:rPr>
-              <w:t>Low (conservative)</w:t>
-            </w:r>
-          </w:p>
-        </w:tc>
-        <w:tc>
-          <w:tcPr>
-            <w:tcW w:w="2200" w:type="dxa"/>
-            <w:tcBorders>
-              <w:top w:val="single" w:sz="4" w:space="0" w:color="D0D5DD"/>
-              <w:left w:val="single" w:sz="4" w:space="0" w:color="D0D5DD"/>
-              <w:bottom w:val="single" w:sz="4" w:space="0" w:color="D0D5DD"/>
-              <w:right w:val="single" w:sz="4" w:space="0" w:color="D0D5DD"/>
-            </w:tcBorders>
-            <w:shd w:val="clear" w:color="auto" w:fill="FFFFFF"/>
-            <w:tcMar>
-              <w:top w:w="100" w:type="dxa"/>
-              <w:left w:w="120" w:type="dxa"/>
-              <w:bottom w:w="100" w:type="dxa"/>
-              <w:right w:w="120" w:type="dxa"/>
-            </w:tcMar>
-            <w:vAlign w:val="center"/>
-          </w:tcPr>
-          <w:p>
-            <w:r>
-              <w:rPr>
-                <w:color w:val="1A2B3C"/>
-                <w:sz w:val="17"/>
-                <w:szCs w:val="17"/>
-              </w:rPr>
-              <w:t>8,000</w:t>
-            </w:r>
-          </w:p>
-        </w:tc>
-        <w:tc>
-          <w:tcPr>
-            <w:tcW w:w="2440" w:type="dxa"/>
-            <w:tcBorders>
-              <w:top w:val="single" w:sz="4" w:space="0" w:color="D0D5DD"/>
-              <w:left w:val="single" w:sz="4" w:space="0" w:color="D0D5DD"/>
-              <w:bottom w:val="single" w:sz="4" w:space="0" w:color="D0D5DD"/>
-              <w:right w:val="single" w:sz="4" w:space="0" w:color="D0D5DD"/>
-            </w:tcBorders>
-            <w:shd w:val="clear" w:color="auto" w:fill="FFFFFF"/>
-            <w:tcMar>
-              <w:top w:w="100" w:type="dxa"/>
-              <w:left w:w="120" w:type="dxa"/>
-              <w:bottom w:w="100" w:type="dxa"/>
-              <w:right w:w="120" w:type="dxa"/>
-            </w:tcMar>
-            <w:vAlign w:val="center"/>
-          </w:tcPr>
-          <w:p>
-            <w:r>
-              <w:rPr>
-                <w:color w:val="1A2B3C"/>
-                <w:sz w:val="17"/>
-                <w:szCs w:val="17"/>
-              </w:rPr>
-              <w:t>$239,520</w:t>
-            </w:r>
-          </w:p>
-        </w:tc>
-        <w:tc>
-          <w:tcPr>
-            <w:tcW w:w="2440" w:type="dxa"/>
-            <w:tcBorders>
-              <w:top w:val="single" w:sz="4" w:space="0" w:color="D0D5DD"/>
-              <w:left w:val="single" w:sz="4" w:space="0" w:color="D0D5DD"/>
-              <w:bottom w:val="single" w:sz="4" w:space="0" w:color="D0D5DD"/>
-              <w:right w:val="single" w:sz="4" w:space="0" w:color="D0D5DD"/>
-            </w:tcBorders>
-            <w:shd w:val="clear" w:color="auto" w:fill="FFFFFF"/>
-            <w:tcMar>
-              <w:top w:w="100" w:type="dxa"/>
-              <w:left w:w="120" w:type="dxa"/>
-              <w:bottom w:w="100" w:type="dxa"/>
-              <w:right w:w="120" w:type="dxa"/>
-            </w:tcMar>
-            <w:vAlign w:val="center"/>
-          </w:tcPr>
-          <w:p>
-            <w:r>
-              <w:rPr>
-                <w:color w:val="1A2B3C"/>
-                <w:sz w:val="17"/>
-                <w:szCs w:val="17"/>
-              </w:rPr>
-              <w:t>$598,800</w:t>
-            </w:r>
-          </w:p>
-        </w:tc>
-      </w:tr>
-      <w:tr>
-        <w:tblPrEx>
-          <w:tblCellMar>
-            <w:top w:w="0" w:type="dxa"/>
-            <w:bottom w:w="0" w:type="dxa"/>
-          </w:tblCellMar>
-        </w:tblPrEx>
-        <w:trPr>
-          <w:cantSplit/>
-        </w:trPr>
-        <w:tc>
-          <w:tcPr>
-            <w:tcW w:w="3000" w:type="dxa"/>
-            <w:tcBorders>
-              <w:top w:val="single" w:sz="4" w:space="0" w:color="D0D5DD"/>
-              <w:left w:val="single" w:sz="4" w:space="0" w:color="D0D5DD"/>
-              <w:bottom w:val="single" w:sz="4" w:space="0" w:color="D0D5DD"/>
-              <w:right w:val="single" w:sz="4" w:space="0" w:color="D0D5DD"/>
-            </w:tcBorders>
-            <w:shd w:val="clear" w:color="auto" w:fill="F5F6F8"/>
-            <w:tcMar>
-              <w:top w:w="100" w:type="dxa"/>
-              <w:left w:w="120" w:type="dxa"/>
-              <w:bottom w:w="100" w:type="dxa"/>
-              <w:right w:w="120" w:type="dxa"/>
-            </w:tcMar>
-            <w:vAlign w:val="center"/>
-          </w:tcPr>
-          <w:p>
-            <w:r>
-              <w:rPr>
-                <w:b/>
-                <w:bCs/>
-                <w:color w:val="1A2B3C"/>
-                <w:sz w:val="17"/>
-                <w:szCs w:val="17"/>
-              </w:rPr>
-              <w:t>Mid (our headline)</w:t>
-            </w:r>
-          </w:p>
-        </w:tc>
-        <w:tc>
-          <w:tcPr>
-            <w:tcW w:w="2200" w:type="dxa"/>
-            <w:tcBorders>
-              <w:top w:val="single" w:sz="4" w:space="0" w:color="D0D5DD"/>
-              <w:left w:val="single" w:sz="4" w:space="0" w:color="D0D5DD"/>
-              <w:bottom w:val="single" w:sz="4" w:space="0" w:color="D0D5DD"/>
-              <w:right w:val="single" w:sz="4" w:space="0" w:color="D0D5DD"/>
-            </w:tcBorders>
-            <w:shd w:val="clear" w:color="auto" w:fill="F5F6F8"/>
-            <w:tcMar>
-              <w:top w:w="100" w:type="dxa"/>
-              <w:left w:w="120" w:type="dxa"/>
-              <w:bottom w:w="100" w:type="dxa"/>
-              <w:right w:w="120" w:type="dxa"/>
-            </w:tcMar>
-            <w:vAlign w:val="center"/>
-          </w:tcPr>
-          <w:p>
-            <w:r>
-              <w:rPr>
-                <w:b/>
-                <w:bCs/>
-                <w:color w:val="1A2B3C"/>
-                <w:sz w:val="17"/>
-                <w:szCs w:val="17"/>
-              </w:rPr>
-              <w:t>9,250</w:t>
-            </w:r>
-          </w:p>
-        </w:tc>
-        <w:tc>
-          <w:tcPr>
-            <w:tcW w:w="2440" w:type="dxa"/>
-            <w:tcBorders>
-              <w:top w:val="single" w:sz="4" w:space="0" w:color="D0D5DD"/>
-              <w:left w:val="single" w:sz="4" w:space="0" w:color="D0D5DD"/>
-              <w:bottom w:val="single" w:sz="4" w:space="0" w:color="D0D5DD"/>
-              <w:right w:val="single" w:sz="4" w:space="0" w:color="D0D5DD"/>
-            </w:tcBorders>
-            <w:shd w:val="clear" w:color="auto" w:fill="F5F6F8"/>
-            <w:tcMar>
-              <w:top w:w="100" w:type="dxa"/>
-              <w:left w:w="120" w:type="dxa"/>
-              <w:bottom w:w="100" w:type="dxa"/>
-              <w:right w:w="120" w:type="dxa"/>
-            </w:tcMar>
-            <w:vAlign w:val="center"/>
-          </w:tcPr>
-          <w:p>
-            <w:r>
-              <w:rPr>
-                <w:b/>
-                <w:bCs/>
-                <w:color w:val="1A2B3C"/>
-                <w:sz w:val="17"/>
-                <w:szCs w:val="17"/>
-              </w:rPr>
-              <w:t>$276,945</w:t>
-            </w:r>
-          </w:p>
-        </w:tc>
-        <w:tc>
-          <w:tcPr>
-            <w:tcW w:w="2440" w:type="dxa"/>
-            <w:tcBorders>
-              <w:top w:val="single" w:sz="4" w:space="0" w:color="D0D5DD"/>
-              <w:left w:val="single" w:sz="4" w:space="0" w:color="D0D5DD"/>
-              <w:bottom w:val="single" w:sz="4" w:space="0" w:color="D0D5DD"/>
-              <w:right w:val="single" w:sz="4" w:space="0" w:color="D0D5DD"/>
-            </w:tcBorders>
-            <w:shd w:val="clear" w:color="auto" w:fill="F5F6F8"/>
-            <w:tcMar>
-              <w:top w:w="100" w:type="dxa"/>
-              <w:left w:w="120" w:type="dxa"/>
-              <w:bottom w:w="100" w:type="dxa"/>
-              <w:right w:w="120" w:type="dxa"/>
-            </w:tcMar>
-            <w:vAlign w:val="center"/>
-          </w:tcPr>
-          <w:p>
-            <w:r>
-              <w:rPr>
-                <w:b/>
-                <w:bCs/>
-                <w:color w:val="1A2B3C"/>
-                <w:sz w:val="17"/>
-                <w:szCs w:val="17"/>
-              </w:rPr>
-              <w:t>$692,363</w:t>
-            </w:r>
-          </w:p>
-        </w:tc>
-      </w:tr>
-      <w:tr>
-        <w:tblPrEx>
-          <w:tblCellMar>
-            <w:top w:w="0" w:type="dxa"/>
-            <w:bottom w:w="0" w:type="dxa"/>
-          </w:tblCellMar>
-        </w:tblPrEx>
-        <w:trPr>
-          <w:cantSplit/>
-        </w:trPr>
-        <w:tc>
-          <w:tcPr>
-            <w:tcW w:w="3000" w:type="dxa"/>
-            <w:tcBorders>
-              <w:top w:val="single" w:sz="4" w:space="0" w:color="D0D5DD"/>
-              <w:left w:val="single" w:sz="4" w:space="0" w:color="D0D5DD"/>
-              <w:bottom w:val="single" w:sz="4" w:space="0" w:color="D0D5DD"/>
-              <w:right w:val="single" w:sz="4" w:space="0" w:color="D0D5DD"/>
-            </w:tcBorders>
-            <w:shd w:val="clear" w:color="auto" w:fill="FFFFFF"/>
-            <w:tcMar>
-              <w:top w:w="100" w:type="dxa"/>
-              <w:left w:w="120" w:type="dxa"/>
-              <w:bottom w:w="100" w:type="dxa"/>
-              <w:right w:w="120" w:type="dxa"/>
-            </w:tcMar>
-            <w:vAlign w:val="center"/>
-          </w:tcPr>
-          <w:p>
-            <w:r>
-              <w:rPr>
-                <w:color w:val="3A4A5C"/>
-                <w:sz w:val="17"/>
-                <w:szCs w:val="17"/>
-              </w:rPr>
-              <w:t>High (stretch)</w:t>
-            </w:r>
-          </w:p>
-        </w:tc>
-        <w:tc>
-          <w:tcPr>
-            <w:tcW w:w="2200" w:type="dxa"/>
-            <w:tcBorders>
-              <w:top w:val="single" w:sz="4" w:space="0" w:color="D0D5DD"/>
-              <w:left w:val="single" w:sz="4" w:space="0" w:color="D0D5DD"/>
-              <w:bottom w:val="single" w:sz="4" w:space="0" w:color="D0D5DD"/>
-              <w:right w:val="single" w:sz="4" w:space="0" w:color="D0D5DD"/>
-            </w:tcBorders>
-            <w:shd w:val="clear" w:color="auto" w:fill="FFFFFF"/>
-            <w:tcMar>
-              <w:top w:w="100" w:type="dxa"/>
-              <w:left w:w="120" w:type="dxa"/>
-              <w:bottom w:w="100" w:type="dxa"/>
-              <w:right w:w="120" w:type="dxa"/>
-            </w:tcMar>
-            <w:vAlign w:val="center"/>
-          </w:tcPr>
-          <w:p>
-            <w:r>
-              <w:rPr>
-                <w:color w:val="1A2B3C"/>
-                <w:sz w:val="17"/>
-                <w:szCs w:val="17"/>
-              </w:rPr>
-              <w:t>10,500</w:t>
-            </w:r>
-          </w:p>
-        </w:tc>
-        <w:tc>
-          <w:tcPr>
-            <w:tcW w:w="2440" w:type="dxa"/>
-            <w:tcBorders>
-              <w:top w:val="single" w:sz="4" w:space="0" w:color="D0D5DD"/>
-              <w:left w:val="single" w:sz="4" w:space="0" w:color="D0D5DD"/>
-              <w:bottom w:val="single" w:sz="4" w:space="0" w:color="D0D5DD"/>
-              <w:right w:val="single" w:sz="4" w:space="0" w:color="D0D5DD"/>
-            </w:tcBorders>
-            <w:shd w:val="clear" w:color="auto" w:fill="FFFFFF"/>
-            <w:tcMar>
-              <w:top w:w="100" w:type="dxa"/>
-              <w:left w:w="120" w:type="dxa"/>
-              <w:bottom w:w="100" w:type="dxa"/>
-              <w:right w:w="120" w:type="dxa"/>
-            </w:tcMar>
-            <w:vAlign w:val="center"/>
-          </w:tcPr>
-          <w:p>
-            <w:r>
-              <w:rPr>
-                <w:color w:val="1A2B3C"/>
-                <w:sz w:val="17"/>
-                <w:szCs w:val="17"/>
-              </w:rPr>
-              <w:t>$314,370</w:t>
-            </w:r>
-          </w:p>
-        </w:tc>
-        <w:tc>
-          <w:tcPr>
-            <w:tcW w:w="2440" w:type="dxa"/>
-            <w:tcBorders>
-              <w:top w:val="single" w:sz="4" w:space="0" w:color="D0D5DD"/>
-              <w:left w:val="single" w:sz="4" w:space="0" w:color="D0D5DD"/>
-              <w:bottom w:val="single" w:sz="4" w:space="0" w:color="D0D5DD"/>
-              <w:right w:val="single" w:sz="4" w:space="0" w:color="D0D5DD"/>
-            </w:tcBorders>
-            <w:shd w:val="clear" w:color="auto" w:fill="FFFFFF"/>
-            <w:tcMar>
-              <w:top w:w="100" w:type="dxa"/>
-              <w:left w:w="120" w:type="dxa"/>
-              <w:bottom w:w="100" w:type="dxa"/>
-              <w:right w:w="120" w:type="dxa"/>
-            </w:tcMar>
-            <w:vAlign w:val="center"/>
-          </w:tcPr>
-          <w:p>
-            <w:r>
-              <w:rPr>
-                <w:color w:val="1A2B3C"/>
-                <w:sz w:val="17"/>
-                <w:szCs w:val="17"/>
-              </w:rPr>
-              <w:t>$785,925</w:t>
-            </w:r>
-          </w:p>
-        </w:tc>
-      </w:tr>
-    </w:tbl>
-    <w:p>
-      <w:pPr>
-        <w:pBdr>
-          <w:bottom w:val="single" w:sz="6" w:space="1" w:color="185FA5"/>
-        </w:pBdr>
-        <w:spacing w:after="200"/>
-      </w:pPr>
-    </w:p>
-    <w:p>
-      <w:pPr>
         <w:spacing w:before="240" w:after="120"/>
       </w:pPr>
       <w:r>
@@ -5563,111 +4908,85 @@
     </w:p>
     <w:p>
       <w:pPr>
-        <w:spacing w:before="180" w:after="80"/>
+        <w:pStyle w:val="Heading2"/>
+      </w:pPr>
+      <w:r>
+        <w:t xml:space="preserve">Warm path &amp; contact intel — v15.36 CRM sync</w:t>
+      </w:r>
+    </w:p>
+    <w:p>
+      <w:pPr>
+        <w:spacing w:before="80" w:after="80"/>
       </w:pPr>
       <w:r>
         <w:rPr>
-          <w:b/>
-          <w:bCs/>
-          <w:color w:val="1A2B3C"/>
-          <w:sz w:val="22"/>
-          <w:szCs w:val="22"/>
+          <w:i/>
+          <w:iCs/>
+          <w:color w:val="6B7280"/>
+          <w:sz w:val="20"/>
+          <w:szCs w:val="20"/>
         </w:rPr>
-        <w:t>Warm path — where we stand</w:t>
+        <w:t xml:space="preserve">Top contacts plus warm-path status. 🟢 active warm angle · 🟡 status change to verify · 🟣 team assignment.</w:t>
       </w:r>
     </w:p>
     <w:tbl>
       <w:tblPr>
-        <w:tblW w:w="10080" w:type="dxa"/>
+        <w:tblW w:w="9000" w:type="dxa"/>
         <w:tblBorders>
-          <w:top w:val="single" w:sz="4" w:space="0" w:color="auto"/>
-          <w:left w:val="single" w:sz="4" w:space="0" w:color="auto"/>
-          <w:bottom w:val="single" w:sz="4" w:space="0" w:color="auto"/>
-          <w:right w:val="single" w:sz="4" w:space="0" w:color="auto"/>
-          <w:insideH w:val="single" w:sz="4" w:space="0" w:color="auto"/>
-          <w:insideV w:val="single" w:sz="4" w:space="0" w:color="auto"/>
+          <w:top w:val="single" w:sz="4" w:space="0" w:color="CCCCCC"/>
+          <w:left w:val="single" w:sz="4" w:space="0" w:color="CCCCCC"/>
+          <w:bottom w:val="single" w:sz="4" w:space="0" w:color="CCCCCC"/>
+          <w:right w:val="single" w:sz="4" w:space="0" w:color="CCCCCC"/>
+          <w:insideH w:val="single" w:sz="4" w:space="0" w:color="CCCCCC"/>
+          <w:insideV w:val="single" w:sz="4" w:space="0" w:color="CCCCCC"/>
         </w:tblBorders>
-        <w:tblCellMar>
-          <w:left w:w="10" w:type="dxa"/>
-          <w:right w:w="10" w:type="dxa"/>
-        </w:tblCellMar>
-        <w:tblLook w:val="0000" w:firstRow="0" w:lastRow="0" w:firstColumn="0" w:lastColumn="0" w:noHBand="0" w:noVBand="0"/>
       </w:tblPr>
       <w:tblGrid>
-        <w:gridCol w:w="2500"/>
-        <w:gridCol w:w="3000"/>
-        <w:gridCol w:w="3500"/>
-        <w:gridCol w:w="1080"/>
+        <w:gridCol w:w="1700"/>
+        <w:gridCol w:w="1900"/>
+        <w:gridCol w:w="1900"/>
+        <w:gridCol w:w="1700"/>
+        <w:gridCol w:w="1800"/>
       </w:tblGrid>
       <w:tr>
-        <w:tblPrEx>
-          <w:tblCellMar>
-            <w:top w:w="0" w:type="dxa"/>
-            <w:bottom w:w="0" w:type="dxa"/>
-          </w:tblCellMar>
-        </w:tblPrEx>
         <w:trPr>
           <w:tblHeader/>
         </w:trPr>
         <w:tc>
           <w:tcPr>
-            <w:tcW w:w="2500" w:type="dxa"/>
-            <w:tcBorders>
-              <w:top w:val="single" w:sz="4" w:space="0" w:color="1A2B3C"/>
-              <w:left w:val="single" w:sz="4" w:space="0" w:color="1A2B3C"/>
-              <w:bottom w:val="single" w:sz="4" w:space="0" w:color="1A2B3C"/>
-              <w:right w:val="single" w:sz="4" w:space="0" w:color="1A2B3C"/>
-            </w:tcBorders>
+            <w:tcW w:w="1700" w:type="dxa"/>
             <w:shd w:val="clear" w:color="auto" w:fill="1A2B3C"/>
-            <w:tcMar>
-              <w:top w:w="100" w:type="dxa"/>
-              <w:left w:w="120" w:type="dxa"/>
-              <w:bottom w:w="100" w:type="dxa"/>
-              <w:right w:w="120" w:type="dxa"/>
-            </w:tcMar>
-            <w:vAlign w:val="center"/>
-          </w:tcPr>
-          <w:p>
+          </w:tcPr>
+          <w:p>
+            <w:pPr>
+              <w:spacing w:before="60" w:after="60"/>
+            </w:pPr>
             <w:r>
               <w:rPr>
                 <w:b/>
                 <w:bCs/>
                 <w:color w:val="FFFFFF"/>
-                <w:spacing w:val="30"/>
-                <w:sz w:val="16"/>
-                <w:szCs w:val="16"/>
-              </w:rPr>
-              <w:t>Target person</w:t>
-            </w:r>
-          </w:p>
-        </w:tc>
-        <w:tc>
-          <w:tcPr>
-            <w:tcW w:w="3000" w:type="dxa"/>
-            <w:tcBorders>
-              <w:top w:val="single" w:sz="4" w:space="0" w:color="1A2B3C"/>
-              <w:left w:val="single" w:sz="4" w:space="0" w:color="1A2B3C"/>
-              <w:bottom w:val="single" w:sz="4" w:space="0" w:color="1A2B3C"/>
-              <w:right w:val="single" w:sz="4" w:space="0" w:color="1A2B3C"/>
-            </w:tcBorders>
+                <w:sz w:val="18"/>
+              </w:rPr>
+              <w:t>Name</w:t>
+            </w:r>
+          </w:p>
+        </w:tc>
+        <w:tc>
+          <w:tcPr>
+            <w:tcW w:w="1900" w:type="dxa"/>
             <w:shd w:val="clear" w:color="auto" w:fill="1A2B3C"/>
-            <w:tcMar>
-              <w:top w:w="100" w:type="dxa"/>
-              <w:left w:w="120" w:type="dxa"/>
-              <w:bottom w:w="100" w:type="dxa"/>
-              <w:right w:w="120" w:type="dxa"/>
-            </w:tcMar>
-            <w:vAlign w:val="center"/>
-          </w:tcPr>
-          <w:p>
+          </w:tcPr>
+          <w:p>
+            <w:pPr>
+              <w:spacing w:before="60" w:after="60"/>
+            </w:pPr>
             <w:r>
               <w:rPr>
                 <w:b/>
                 <w:bCs/>
                 <w:color w:val="FFFFFF"/>
-                <w:spacing w:val="30"/>
-                <w:sz w:val="16"/>
-                <w:szCs w:val="16"/>
+                <w:sz w:val="18"/>
               </w:rPr>
               <w:t>Role</w:t>
             </w:r>
@@ -5675,556 +4994,943 @@
         </w:tc>
         <w:tc>
           <w:tcPr>
-            <w:tcW w:w="3500" w:type="dxa"/>
-            <w:tcBorders>
-              <w:top w:val="single" w:sz="4" w:space="0" w:color="1A2B3C"/>
-              <w:left w:val="single" w:sz="4" w:space="0" w:color="1A2B3C"/>
-              <w:bottom w:val="single" w:sz="4" w:space="0" w:color="1A2B3C"/>
-              <w:right w:val="single" w:sz="4" w:space="0" w:color="1A2B3C"/>
-            </w:tcBorders>
+            <w:tcW w:w="1900" w:type="dxa"/>
             <w:shd w:val="clear" w:color="auto" w:fill="1A2B3C"/>
-            <w:tcMar>
-              <w:top w:w="100" w:type="dxa"/>
-              <w:left w:w="120" w:type="dxa"/>
-              <w:bottom w:w="100" w:type="dxa"/>
-              <w:right w:w="120" w:type="dxa"/>
-            </w:tcMar>
-            <w:vAlign w:val="center"/>
-          </w:tcPr>
-          <w:p>
+          </w:tcPr>
+          <w:p>
+            <w:pPr>
+              <w:spacing w:before="60" w:after="60"/>
+            </w:pPr>
             <w:r>
               <w:rPr>
                 <w:b/>
                 <w:bCs/>
                 <w:color w:val="FFFFFF"/>
-                <w:spacing w:val="30"/>
-                <w:sz w:val="16"/>
-                <w:szCs w:val="16"/>
-              </w:rPr>
-              <w:t>Warm path</w:t>
-            </w:r>
-          </w:p>
-        </w:tc>
-        <w:tc>
-          <w:tcPr>
-            <w:tcW w:w="1080" w:type="dxa"/>
-            <w:tcBorders>
-              <w:top w:val="single" w:sz="4" w:space="0" w:color="1A2B3C"/>
-              <w:left w:val="single" w:sz="4" w:space="0" w:color="1A2B3C"/>
-              <w:bottom w:val="single" w:sz="4" w:space="0" w:color="1A2B3C"/>
-              <w:right w:val="single" w:sz="4" w:space="0" w:color="1A2B3C"/>
-            </w:tcBorders>
+                <w:sz w:val="18"/>
+              </w:rPr>
+              <w:t>LinkedIn</w:t>
+            </w:r>
+          </w:p>
+        </w:tc>
+        <w:tc>
+          <w:tcPr>
+            <w:tcW w:w="1700" w:type="dxa"/>
             <w:shd w:val="clear" w:color="auto" w:fill="1A2B3C"/>
-            <w:tcMar>
-              <w:top w:w="100" w:type="dxa"/>
-              <w:left w:w="120" w:type="dxa"/>
-              <w:bottom w:w="100" w:type="dxa"/>
-              <w:right w:w="120" w:type="dxa"/>
-            </w:tcMar>
-            <w:vAlign w:val="center"/>
-          </w:tcPr>
-          <w:p/>
+          </w:tcPr>
+          <w:p>
+            <w:pPr>
+              <w:spacing w:before="60" w:after="60"/>
+            </w:pPr>
+            <w:r>
+              <w:rPr>
+                <w:b/>
+                <w:bCs/>
+                <w:color w:val="FFFFFF"/>
+                <w:sz w:val="18"/>
+              </w:rPr>
+              <w:t>School</w:t>
+            </w:r>
+          </w:p>
+        </w:tc>
+        <w:tc>
+          <w:tcPr>
+            <w:tcW w:w="1800" w:type="dxa"/>
+            <w:shd w:val="clear" w:color="auto" w:fill="1A2B3C"/>
+          </w:tcPr>
+          <w:p>
+            <w:pPr>
+              <w:spacing w:before="60" w:after="60"/>
+            </w:pPr>
+            <w:r>
+              <w:rPr>
+                <w:b/>
+                <w:bCs/>
+                <w:color w:val="FFFFFF"/>
+                <w:sz w:val="18"/>
+              </w:rPr>
+              <w:t>Warm-Path Status / Notes</w:t>
+            </w:r>
+          </w:p>
         </w:tc>
       </w:tr>
       <w:tr>
-        <w:tblPrEx>
-          <w:tblCellMar>
-            <w:top w:w="0" w:type="dxa"/>
-            <w:bottom w:w="0" w:type="dxa"/>
-          </w:tblCellMar>
-        </w:tblPrEx>
-        <w:trPr>
-          <w:cantSplit/>
-        </w:trPr>
-        <w:tc>
-          <w:tcPr>
-            <w:tcW w:w="2500" w:type="dxa"/>
-            <w:tcBorders>
-              <w:top w:val="single" w:sz="4" w:space="0" w:color="D0D5DD"/>
-              <w:left w:val="single" w:sz="4" w:space="0" w:color="D0D5DD"/>
-              <w:bottom w:val="single" w:sz="4" w:space="0" w:color="D0D5DD"/>
-              <w:right w:val="single" w:sz="4" w:space="0" w:color="D0D5DD"/>
-            </w:tcBorders>
-            <w:shd w:val="clear" w:color="auto" w:fill="FFFFFF"/>
-            <w:tcMar>
-              <w:top w:w="100" w:type="dxa"/>
-              <w:left w:w="120" w:type="dxa"/>
-              <w:bottom w:w="100" w:type="dxa"/>
-              <w:right w:w="120" w:type="dxa"/>
-            </w:tcMar>
-            <w:vAlign w:val="center"/>
-          </w:tcPr>
-          <w:p>
-            <w:r>
-              <w:rPr>
-                <w:b/>
-                <w:bCs/>
-                <w:color w:val="1A2B3C"/>
-                <w:sz w:val="17"/>
-                <w:szCs w:val="17"/>
-              </w:rPr>
-              <w:t>Doug Smith</w:t>
-            </w:r>
-          </w:p>
-        </w:tc>
-        <w:tc>
-          <w:tcPr>
-            <w:tcW w:w="3000" w:type="dxa"/>
-            <w:tcBorders>
-              <w:top w:val="single" w:sz="4" w:space="0" w:color="D0D5DD"/>
-              <w:left w:val="single" w:sz="4" w:space="0" w:color="D0D5DD"/>
-              <w:bottom w:val="single" w:sz="4" w:space="0" w:color="D0D5DD"/>
-              <w:right w:val="single" w:sz="4" w:space="0" w:color="D0D5DD"/>
-            </w:tcBorders>
-            <w:shd w:val="clear" w:color="auto" w:fill="FFFFFF"/>
-            <w:tcMar>
-              <w:top w:w="100" w:type="dxa"/>
-              <w:left w:w="120" w:type="dxa"/>
-              <w:bottom w:w="100" w:type="dxa"/>
-              <w:right w:w="120" w:type="dxa"/>
-            </w:tcMar>
-            <w:vAlign w:val="center"/>
-          </w:tcPr>
-          <w:p>
-            <w:r>
-              <w:rPr>
-                <w:color w:val="3A4A5C"/>
-                <w:sz w:val="17"/>
-                <w:szCs w:val="17"/>
-              </w:rPr>
-              <w:t>SVP Franchise Development</w:t>
-            </w:r>
-          </w:p>
-        </w:tc>
-        <w:tc>
-          <w:tcPr>
-            <w:tcW w:w="3500" w:type="dxa"/>
-            <w:tcBorders>
-              <w:top w:val="single" w:sz="4" w:space="0" w:color="D0D5DD"/>
-              <w:left w:val="single" w:sz="4" w:space="0" w:color="D0D5DD"/>
-              <w:bottom w:val="single" w:sz="4" w:space="0" w:color="D0D5DD"/>
-              <w:right w:val="single" w:sz="4" w:space="0" w:color="D0D5DD"/>
-            </w:tcBorders>
-            <w:shd w:val="clear" w:color="auto" w:fill="FFFFFF"/>
-            <w:tcMar>
-              <w:top w:w="100" w:type="dxa"/>
-              <w:left w:w="120" w:type="dxa"/>
-              <w:bottom w:w="100" w:type="dxa"/>
-              <w:right w:w="120" w:type="dxa"/>
-            </w:tcMar>
-            <w:vAlign w:val="center"/>
-          </w:tcPr>
-          <w:p>
-            <w:r>
-              <w:rPr>
-                <w:color w:val="3A4A5C"/>
-                <w:sz w:val="17"/>
-                <w:szCs w:val="17"/>
-              </w:rPr>
-              <w:t>Direct outreach OK — natural FD conversation</w:t>
-            </w:r>
-          </w:p>
-        </w:tc>
-        <w:tc>
-          <w:tcPr>
-            <w:tcW w:w="1080" w:type="dxa"/>
-            <w:tcBorders>
-              <w:top w:val="single" w:sz="4" w:space="0" w:color="D0D5DD"/>
-              <w:left w:val="single" w:sz="4" w:space="0" w:color="D0D5DD"/>
-              <w:bottom w:val="single" w:sz="4" w:space="0" w:color="D0D5DD"/>
-              <w:right w:val="single" w:sz="4" w:space="0" w:color="D0D5DD"/>
-            </w:tcBorders>
-            <w:shd w:val="clear" w:color="auto" w:fill="FFFFFF"/>
-            <w:tcMar>
-              <w:top w:w="100" w:type="dxa"/>
-              <w:left w:w="120" w:type="dxa"/>
-              <w:bottom w:w="100" w:type="dxa"/>
-              <w:right w:w="120" w:type="dxa"/>
-            </w:tcMar>
-            <w:vAlign w:val="center"/>
-          </w:tcPr>
-          <w:p/>
+        <w:tc>
+          <w:tcPr>
+            <w:tcW w:w="1700" w:type="dxa"/>
+            <w:shd w:val="clear" w:color="auto" w:fill="FFFFFF"/>
+          </w:tcPr>
+          <w:p>
+            <w:pPr>
+              <w:spacing w:before="40" w:after="40"/>
+            </w:pPr>
+            <w:r>
+              <w:rPr>
+                <w:b/>
+                <w:bCs/>
+                <w:sz w:val="18"/>
+              </w:rPr>
+              <w:t xml:space="preserve">Sheldon Yellen</w:t>
+            </w:r>
+          </w:p>
+        </w:tc>
+        <w:tc>
+          <w:tcPr>
+            <w:tcW w:w="1900" w:type="dxa"/>
+            <w:shd w:val="clear" w:color="auto" w:fill="FFFFFF"/>
+          </w:tcPr>
+          <w:p>
+            <w:pPr>
+              <w:spacing w:before="40" w:after="40"/>
+            </w:pPr>
+            <w:r>
+              <w:rPr>
+                <w:sz w:val="18"/>
+              </w:rPr>
+              <w:t xml:space="preserve">CEO BELFOR Holdings $3B</w:t>
+            </w:r>
+          </w:p>
+        </w:tc>
+        <w:tc>
+          <w:tcPr>
+            <w:tcW w:w="1900" w:type="dxa"/>
+            <w:shd w:val="clear" w:color="auto" w:fill="FFFFFF"/>
+          </w:tcPr>
+          <w:p>
+            <w:pPr>
+              <w:spacing w:before="40" w:after="40"/>
+            </w:pPr>
+            <w:r>
+              <w:rPr>
+                <w:color w:val="185FA5"/>
+                <w:sz w:val="16"/>
+              </w:rPr>
+              <w:t xml:space="preserve">sheldon-yellen-belfor</w:t>
+            </w:r>
+          </w:p>
+        </w:tc>
+        <w:tc>
+          <w:tcPr>
+            <w:tcW w:w="1700" w:type="dxa"/>
+            <w:shd w:val="clear" w:color="auto" w:fill="FFFFFF"/>
+          </w:tcPr>
+          <w:p>
+            <w:pPr>
+              <w:spacing w:before="40" w:after="40"/>
+            </w:pPr>
+            <w:r>
+              <w:rPr>
+                <w:sz w:val="16"/>
+              </w:rPr>
+              <w:t xml:space="preserve">Southfield-Lathrup HS DROPOUT (got diploma at age 53!). Detroit MI welfare childhood. Star</w:t>
+            </w:r>
+          </w:p>
+        </w:tc>
+        <w:tc>
+          <w:tcPr>
+            <w:tcW w:w="1800" w:type="dxa"/>
+            <w:shd w:val="clear" w:color="auto" w:fill="FFFFFF"/>
+          </w:tcPr>
+          <w:p>
+            <w:pPr>
+              <w:spacing w:before="40" w:after="40"/>
+            </w:pPr>
+            <w:r>
+              <w:rPr>
+                <w:i/>
+                <w:iCs/>
+                <w:sz w:val="16"/>
+              </w:rPr>
+              <w:t xml:space="preserve"/>
+            </w:r>
+          </w:p>
         </w:tc>
       </w:tr>
       <w:tr>
-        <w:tblPrEx>
-          <w:tblCellMar>
-            <w:top w:w="0" w:type="dxa"/>
-            <w:bottom w:w="0" w:type="dxa"/>
-          </w:tblCellMar>
-        </w:tblPrEx>
-        <w:trPr>
-          <w:cantSplit/>
-        </w:trPr>
-        <w:tc>
-          <w:tcPr>
-            <w:tcW w:w="2500" w:type="dxa"/>
-            <w:tcBorders>
-              <w:top w:val="single" w:sz="4" w:space="0" w:color="D0D5DD"/>
-              <w:left w:val="single" w:sz="4" w:space="0" w:color="D0D5DD"/>
-              <w:bottom w:val="single" w:sz="4" w:space="0" w:color="D0D5DD"/>
-              <w:right w:val="single" w:sz="4" w:space="0" w:color="D0D5DD"/>
-            </w:tcBorders>
-            <w:shd w:val="clear" w:color="auto" w:fill="F5F6F8"/>
-            <w:tcMar>
-              <w:top w:w="100" w:type="dxa"/>
-              <w:left w:w="120" w:type="dxa"/>
-              <w:bottom w:w="100" w:type="dxa"/>
-              <w:right w:w="120" w:type="dxa"/>
-            </w:tcMar>
-            <w:vAlign w:val="center"/>
-          </w:tcPr>
-          <w:p>
-            <w:r>
-              <w:rPr>
-                <w:b/>
-                <w:bCs/>
-                <w:color w:val="1A2B3C"/>
-                <w:sz w:val="17"/>
-                <w:szCs w:val="17"/>
-              </w:rPr>
-              <w:t>Beth Toenies</w:t>
-            </w:r>
-          </w:p>
-        </w:tc>
-        <w:tc>
-          <w:tcPr>
-            <w:tcW w:w="3000" w:type="dxa"/>
-            <w:tcBorders>
-              <w:top w:val="single" w:sz="4" w:space="0" w:color="D0D5DD"/>
-              <w:left w:val="single" w:sz="4" w:space="0" w:color="D0D5DD"/>
-              <w:bottom w:val="single" w:sz="4" w:space="0" w:color="D0D5DD"/>
-              <w:right w:val="single" w:sz="4" w:space="0" w:color="D0D5DD"/>
-            </w:tcBorders>
-            <w:shd w:val="clear" w:color="auto" w:fill="F5F6F8"/>
-            <w:tcMar>
-              <w:top w:w="100" w:type="dxa"/>
-              <w:left w:w="120" w:type="dxa"/>
-              <w:bottom w:w="100" w:type="dxa"/>
-              <w:right w:w="120" w:type="dxa"/>
-            </w:tcMar>
-            <w:vAlign w:val="center"/>
-          </w:tcPr>
-          <w:p>
-            <w:r>
-              <w:rPr>
-                <w:color w:val="3A4A5C"/>
-                <w:sz w:val="17"/>
-                <w:szCs w:val="17"/>
-              </w:rPr>
-              <w:t>VP Franchise Development</w:t>
-            </w:r>
-          </w:p>
-        </w:tc>
-        <w:tc>
-          <w:tcPr>
-            <w:tcW w:w="3500" w:type="dxa"/>
-            <w:tcBorders>
-              <w:top w:val="single" w:sz="4" w:space="0" w:color="D0D5DD"/>
-              <w:left w:val="single" w:sz="4" w:space="0" w:color="D0D5DD"/>
-              <w:bottom w:val="single" w:sz="4" w:space="0" w:color="D0D5DD"/>
-              <w:right w:val="single" w:sz="4" w:space="0" w:color="D0D5DD"/>
-            </w:tcBorders>
-            <w:shd w:val="clear" w:color="auto" w:fill="F5F6F8"/>
-            <w:tcMar>
-              <w:top w:w="100" w:type="dxa"/>
-              <w:left w:w="120" w:type="dxa"/>
-              <w:bottom w:w="100" w:type="dxa"/>
-              <w:right w:w="120" w:type="dxa"/>
-            </w:tcMar>
-            <w:vAlign w:val="center"/>
-          </w:tcPr>
-          <w:p>
-            <w:r>
-              <w:rPr>
-                <w:color w:val="3A4A5C"/>
-                <w:sz w:val="17"/>
-                <w:szCs w:val="17"/>
-              </w:rPr>
-              <w:t>Direct outreach OK — second-stage warm path</w:t>
-            </w:r>
-          </w:p>
-        </w:tc>
-        <w:tc>
-          <w:tcPr>
-            <w:tcW w:w="1080" w:type="dxa"/>
-            <w:tcBorders>
-              <w:top w:val="single" w:sz="4" w:space="0" w:color="D0D5DD"/>
-              <w:left w:val="single" w:sz="4" w:space="0" w:color="D0D5DD"/>
-              <w:bottom w:val="single" w:sz="4" w:space="0" w:color="D0D5DD"/>
-              <w:right w:val="single" w:sz="4" w:space="0" w:color="D0D5DD"/>
-            </w:tcBorders>
-            <w:shd w:val="clear" w:color="auto" w:fill="F5F6F8"/>
-            <w:tcMar>
-              <w:top w:w="100" w:type="dxa"/>
-              <w:left w:w="120" w:type="dxa"/>
-              <w:bottom w:w="100" w:type="dxa"/>
-              <w:right w:w="120" w:type="dxa"/>
-            </w:tcMar>
-            <w:vAlign w:val="center"/>
-          </w:tcPr>
-          <w:p/>
+        <w:tc>
+          <w:tcPr>
+            <w:tcW w:w="1700" w:type="dxa"/>
+            <w:shd w:val="clear" w:color="auto" w:fill="FFFFFF"/>
+          </w:tcPr>
+          <w:p>
+            <w:pPr>
+              <w:spacing w:before="40" w:after="40"/>
+            </w:pPr>
+            <w:r>
+              <w:rPr>
+                <w:b/>
+                <w:bCs/>
+                <w:sz w:val="18"/>
+              </w:rPr>
+              <w:t xml:space="preserve">Rusty Amarante CR</w:t>
+            </w:r>
+          </w:p>
+        </w:tc>
+        <w:tc>
+          <w:tcPr>
+            <w:tcW w:w="1900" w:type="dxa"/>
+            <w:shd w:val="clear" w:color="auto" w:fill="FFFFFF"/>
+          </w:tcPr>
+          <w:p>
+            <w:pPr>
+              <w:spacing w:before="40" w:after="40"/>
+            </w:pPr>
+            <w:r>
+              <w:rPr>
+                <w:sz w:val="18"/>
+              </w:rPr>
+              <w:t xml:space="preserve">Pres BELFOR FG + Director Ops Property Restoration</w:t>
+            </w:r>
+          </w:p>
+        </w:tc>
+        <w:tc>
+          <w:tcPr>
+            <w:tcW w:w="1900" w:type="dxa"/>
+            <w:shd w:val="clear" w:color="auto" w:fill="FFFFFF"/>
+          </w:tcPr>
+          <w:p>
+            <w:pPr>
+              <w:spacing w:before="40" w:after="40"/>
+            </w:pPr>
+            <w:r>
+              <w:rPr>
+                <w:color w:val="185FA5"/>
+                <w:sz w:val="16"/>
+              </w:rPr>
+              <w:t xml:space="preserve"/>
+            </w:r>
+          </w:p>
+        </w:tc>
+        <w:tc>
+          <w:tcPr>
+            <w:tcW w:w="1700" w:type="dxa"/>
+            <w:shd w:val="clear" w:color="auto" w:fill="FFFFFF"/>
+          </w:tcPr>
+          <w:p>
+            <w:pPr>
+              <w:spacing w:before="40" w:after="40"/>
+            </w:pPr>
+            <w:r>
+              <w:rPr>
+                <w:sz w:val="16"/>
+              </w:rPr>
+              <w:t xml:space="preserve">40+ yrs restoration. Past-Pres RIA. Vice Chair IICRC S500 Standard.</w:t>
+            </w:r>
+          </w:p>
+        </w:tc>
+        <w:tc>
+          <w:tcPr>
+            <w:tcW w:w="1800" w:type="dxa"/>
+            <w:shd w:val="clear" w:color="auto" w:fill="FFFFFF"/>
+          </w:tcPr>
+          <w:p>
+            <w:pPr>
+              <w:spacing w:before="40" w:after="40"/>
+            </w:pPr>
+            <w:r>
+              <w:rPr>
+                <w:i/>
+                <w:iCs/>
+                <w:sz w:val="16"/>
+              </w:rPr>
+              <w:t xml:space="preserve"/>
+            </w:r>
+          </w:p>
         </w:tc>
       </w:tr>
       <w:tr>
-        <w:tblPrEx>
-          <w:tblCellMar>
-            <w:top w:w="0" w:type="dxa"/>
-            <w:bottom w:w="0" w:type="dxa"/>
-          </w:tblCellMar>
-        </w:tblPrEx>
-        <w:trPr>
-          <w:cantSplit/>
-        </w:trPr>
-        <w:tc>
-          <w:tcPr>
-            <w:tcW w:w="2500" w:type="dxa"/>
-            <w:tcBorders>
-              <w:top w:val="single" w:sz="4" w:space="0" w:color="D0D5DD"/>
-              <w:left w:val="single" w:sz="4" w:space="0" w:color="D0D5DD"/>
-              <w:bottom w:val="single" w:sz="4" w:space="0" w:color="D0D5DD"/>
-              <w:right w:val="single" w:sz="4" w:space="0" w:color="D0D5DD"/>
-            </w:tcBorders>
-            <w:shd w:val="clear" w:color="auto" w:fill="FFFFFF"/>
-            <w:tcMar>
-              <w:top w:w="100" w:type="dxa"/>
-              <w:left w:w="120" w:type="dxa"/>
-              <w:bottom w:w="100" w:type="dxa"/>
-              <w:right w:w="120" w:type="dxa"/>
-            </w:tcMar>
-            <w:vAlign w:val="center"/>
-          </w:tcPr>
-          <w:p>
-            <w:r>
-              <w:rPr>
-                <w:b/>
-                <w:bCs/>
-                <w:color w:val="1A2B3C"/>
-                <w:sz w:val="17"/>
-                <w:szCs w:val="17"/>
-              </w:rPr>
-              <w:t>Rusty Amarante</w:t>
-            </w:r>
-          </w:p>
-        </w:tc>
-        <w:tc>
-          <w:tcPr>
-            <w:tcW w:w="3000" w:type="dxa"/>
-            <w:tcBorders>
-              <w:top w:val="single" w:sz="4" w:space="0" w:color="D0D5DD"/>
-              <w:left w:val="single" w:sz="4" w:space="0" w:color="D0D5DD"/>
-              <w:bottom w:val="single" w:sz="4" w:space="0" w:color="D0D5DD"/>
-              <w:right w:val="single" w:sz="4" w:space="0" w:color="D0D5DD"/>
-            </w:tcBorders>
-            <w:shd w:val="clear" w:color="auto" w:fill="FFFFFF"/>
-            <w:tcMar>
-              <w:top w:w="100" w:type="dxa"/>
-              <w:left w:w="120" w:type="dxa"/>
-              <w:bottom w:w="100" w:type="dxa"/>
-              <w:right w:w="120" w:type="dxa"/>
-            </w:tcMar>
-            <w:vAlign w:val="center"/>
-          </w:tcPr>
-          <w:p>
-            <w:r>
-              <w:rPr>
-                <w:color w:val="3A4A5C"/>
-                <w:sz w:val="17"/>
-                <w:szCs w:val="17"/>
-              </w:rPr>
-              <w:t>President BFG</w:t>
-            </w:r>
-          </w:p>
-        </w:tc>
-        <w:tc>
-          <w:tcPr>
-            <w:tcW w:w="3500" w:type="dxa"/>
-            <w:tcBorders>
-              <w:top w:val="single" w:sz="4" w:space="0" w:color="D0D5DD"/>
-              <w:left w:val="single" w:sz="4" w:space="0" w:color="D0D5DD"/>
-              <w:bottom w:val="single" w:sz="4" w:space="0" w:color="D0D5DD"/>
-              <w:right w:val="single" w:sz="4" w:space="0" w:color="D0D5DD"/>
-            </w:tcBorders>
-            <w:shd w:val="clear" w:color="auto" w:fill="FFFFFF"/>
-            <w:tcMar>
-              <w:top w:w="100" w:type="dxa"/>
-              <w:left w:w="120" w:type="dxa"/>
-              <w:bottom w:w="100" w:type="dxa"/>
-              <w:right w:w="120" w:type="dxa"/>
-            </w:tcMar>
-            <w:vAlign w:val="center"/>
-          </w:tcPr>
-          <w:p>
-            <w:r>
-              <w:rPr>
-                <w:color w:val="3A4A5C"/>
-                <w:sz w:val="17"/>
-                <w:szCs w:val="17"/>
-              </w:rPr>
-              <w:t>After Smith/Toenies alignment</w:t>
-            </w:r>
-          </w:p>
-        </w:tc>
-        <w:tc>
-          <w:tcPr>
-            <w:tcW w:w="1080" w:type="dxa"/>
-            <w:tcBorders>
-              <w:top w:val="single" w:sz="4" w:space="0" w:color="D0D5DD"/>
-              <w:left w:val="single" w:sz="4" w:space="0" w:color="D0D5DD"/>
-              <w:bottom w:val="single" w:sz="4" w:space="0" w:color="D0D5DD"/>
-              <w:right w:val="single" w:sz="4" w:space="0" w:color="D0D5DD"/>
-            </w:tcBorders>
-            <w:shd w:val="clear" w:color="auto" w:fill="FFFFFF"/>
-            <w:tcMar>
-              <w:top w:w="100" w:type="dxa"/>
-              <w:left w:w="120" w:type="dxa"/>
-              <w:bottom w:w="100" w:type="dxa"/>
-              <w:right w:w="120" w:type="dxa"/>
-            </w:tcMar>
-            <w:vAlign w:val="center"/>
-          </w:tcPr>
-          <w:p/>
+        <w:tc>
+          <w:tcPr>
+            <w:tcW w:w="1700" w:type="dxa"/>
+            <w:shd w:val="clear" w:color="auto" w:fill="FEF3C7"/>
+          </w:tcPr>
+          <w:p>
+            <w:pPr>
+              <w:spacing w:before="40" w:after="40"/>
+            </w:pPr>
+            <w:r>
+              <w:rPr>
+                <w:b/>
+                <w:bCs/>
+                <w:sz w:val="18"/>
+              </w:rPr>
+              <w:t xml:space="preserve">Doug Smith</w:t>
+            </w:r>
+          </w:p>
+        </w:tc>
+        <w:tc>
+          <w:tcPr>
+            <w:tcW w:w="1900" w:type="dxa"/>
+            <w:shd w:val="clear" w:color="auto" w:fill="FEF3C7"/>
+          </w:tcPr>
+          <w:p>
+            <w:pPr>
+              <w:spacing w:before="40" w:after="40"/>
+            </w:pPr>
+            <w:r>
+              <w:rPr>
+                <w:sz w:val="18"/>
+              </w:rPr>
+              <w:t xml:space="preserve">SVP Franchise Dev</w:t>
+            </w:r>
+          </w:p>
+        </w:tc>
+        <w:tc>
+          <w:tcPr>
+            <w:tcW w:w="1900" w:type="dxa"/>
+            <w:shd w:val="clear" w:color="auto" w:fill="FEF3C7"/>
+          </w:tcPr>
+          <w:p>
+            <w:pPr>
+              <w:spacing w:before="40" w:after="40"/>
+            </w:pPr>
+            <w:r>
+              <w:rPr>
+                <w:color w:val="185FA5"/>
+                <w:sz w:val="16"/>
+              </w:rPr>
+              <w:t xml:space="preserve">dougsmith-belfor</w:t>
+            </w:r>
+          </w:p>
+        </w:tc>
+        <w:tc>
+          <w:tcPr>
+            <w:tcW w:w="1700" w:type="dxa"/>
+            <w:shd w:val="clear" w:color="auto" w:fill="FEF3C7"/>
+          </w:tcPr>
+          <w:p>
+            <w:pPr>
+              <w:spacing w:before="40" w:after="40"/>
+            </w:pPr>
+            <w:r>
+              <w:rPr>
+                <w:sz w:val="16"/>
+              </w:rPr>
+              <w:t xml:space="preserve">U. of Louisville Business connection (FranchiseU! Episode 82 podcast 2024). 14 yrs SVP Sal</w:t>
+            </w:r>
+          </w:p>
+        </w:tc>
+        <w:tc>
+          <w:tcPr>
+            <w:tcW w:w="1800" w:type="dxa"/>
+            <w:shd w:val="clear" w:color="auto" w:fill="FEF3C7"/>
+          </w:tcPr>
+          <w:p>
+            <w:pPr>
+              <w:spacing w:before="40" w:after="40"/>
+            </w:pPr>
+            <w:r>
+              <w:rPr>
+                <w:i/>
+                <w:iCs/>
+                <w:sz w:val="16"/>
+              </w:rPr>
+              <w:t xml:space="preserve">Looks like Doug may have just left belfor</w:t>
+            </w:r>
+          </w:p>
         </w:tc>
       </w:tr>
       <w:tr>
-        <w:tblPrEx>
-          <w:tblCellMar>
-            <w:top w:w="0" w:type="dxa"/>
-            <w:bottom w:w="0" w:type="dxa"/>
-          </w:tblCellMar>
-        </w:tblPrEx>
-        <w:trPr>
-          <w:cantSplit/>
-        </w:trPr>
-        <w:tc>
-          <w:tcPr>
-            <w:tcW w:w="2500" w:type="dxa"/>
-            <w:tcBorders>
-              <w:top w:val="single" w:sz="4" w:space="0" w:color="D0D5DD"/>
-              <w:left w:val="single" w:sz="4" w:space="0" w:color="D0D5DD"/>
-              <w:bottom w:val="single" w:sz="4" w:space="0" w:color="D0D5DD"/>
-              <w:right w:val="single" w:sz="4" w:space="0" w:color="D0D5DD"/>
-            </w:tcBorders>
-            <w:shd w:val="clear" w:color="auto" w:fill="F5F6F8"/>
-            <w:tcMar>
-              <w:top w:w="100" w:type="dxa"/>
-              <w:left w:w="120" w:type="dxa"/>
-              <w:bottom w:w="100" w:type="dxa"/>
-              <w:right w:w="120" w:type="dxa"/>
-            </w:tcMar>
-            <w:vAlign w:val="center"/>
-          </w:tcPr>
-          <w:p>
-            <w:r>
-              <w:rPr>
-                <w:b/>
-                <w:bCs/>
-                <w:color w:val="1A2B3C"/>
-                <w:sz w:val="17"/>
-                <w:szCs w:val="17"/>
-              </w:rPr>
-              <w:t>American Securities operating partner</w:t>
-            </w:r>
-          </w:p>
-        </w:tc>
-        <w:tc>
-          <w:tcPr>
-            <w:tcW w:w="3000" w:type="dxa"/>
-            <w:tcBorders>
-              <w:top w:val="single" w:sz="4" w:space="0" w:color="D0D5DD"/>
-              <w:left w:val="single" w:sz="4" w:space="0" w:color="D0D5DD"/>
-              <w:bottom w:val="single" w:sz="4" w:space="0" w:color="D0D5DD"/>
-              <w:right w:val="single" w:sz="4" w:space="0" w:color="D0D5DD"/>
-            </w:tcBorders>
-            <w:shd w:val="clear" w:color="auto" w:fill="F5F6F8"/>
-            <w:tcMar>
-              <w:top w:w="100" w:type="dxa"/>
-              <w:left w:w="120" w:type="dxa"/>
-              <w:bottom w:w="100" w:type="dxa"/>
-              <w:right w:w="120" w:type="dxa"/>
-            </w:tcMar>
-            <w:vAlign w:val="center"/>
-          </w:tcPr>
-          <w:p>
-            <w:r>
-              <w:rPr>
-                <w:color w:val="3A4A5C"/>
-                <w:sz w:val="17"/>
-                <w:szCs w:val="17"/>
-              </w:rPr>
-              <w:t>PE-level VCI conversation</w:t>
-            </w:r>
-          </w:p>
-        </w:tc>
-        <w:tc>
-          <w:tcPr>
-            <w:tcW w:w="3500" w:type="dxa"/>
-            <w:tcBorders>
-              <w:top w:val="single" w:sz="4" w:space="0" w:color="D0D5DD"/>
-              <w:left w:val="single" w:sz="4" w:space="0" w:color="D0D5DD"/>
-              <w:bottom w:val="single" w:sz="4" w:space="0" w:color="D0D5DD"/>
-              <w:right w:val="single" w:sz="4" w:space="0" w:color="D0D5DD"/>
-            </w:tcBorders>
-            <w:shd w:val="clear" w:color="auto" w:fill="F5F6F8"/>
-            <w:tcMar>
-              <w:top w:w="100" w:type="dxa"/>
-              <w:left w:w="120" w:type="dxa"/>
-              <w:bottom w:w="100" w:type="dxa"/>
-              <w:right w:w="120" w:type="dxa"/>
-            </w:tcMar>
-            <w:vAlign w:val="center"/>
-          </w:tcPr>
-          <w:p>
-            <w:r>
-              <w:rPr>
-                <w:color w:val="3A4A5C"/>
-                <w:sz w:val="17"/>
-                <w:szCs w:val="17"/>
-              </w:rPr>
-              <w:t>Activate via GPSI team / CFO Garrett</w:t>
-            </w:r>
-          </w:p>
-        </w:tc>
-        <w:tc>
-          <w:tcPr>
-            <w:tcW w:w="1080" w:type="dxa"/>
-            <w:tcBorders>
-              <w:top w:val="single" w:sz="4" w:space="0" w:color="D0D5DD"/>
-              <w:left w:val="single" w:sz="4" w:space="0" w:color="D0D5DD"/>
-              <w:bottom w:val="single" w:sz="4" w:space="0" w:color="D0D5DD"/>
-              <w:right w:val="single" w:sz="4" w:space="0" w:color="D0D5DD"/>
-            </w:tcBorders>
-            <w:shd w:val="clear" w:color="auto" w:fill="F5F6F8"/>
-            <w:tcMar>
-              <w:top w:w="100" w:type="dxa"/>
-              <w:left w:w="120" w:type="dxa"/>
-              <w:bottom w:w="100" w:type="dxa"/>
-              <w:right w:w="120" w:type="dxa"/>
-            </w:tcMar>
-            <w:vAlign w:val="center"/>
-          </w:tcPr>
-          <w:p/>
+        <w:tc>
+          <w:tcPr>
+            <w:tcW w:w="1700" w:type="dxa"/>
+            <w:shd w:val="clear" w:color="auto" w:fill="FFFFFF"/>
+          </w:tcPr>
+          <w:p>
+            <w:pPr>
+              <w:spacing w:before="40" w:after="40"/>
+            </w:pPr>
+            <w:r>
+              <w:rPr>
+                <w:b/>
+                <w:bCs/>
+                <w:sz w:val="18"/>
+              </w:rPr>
+              <w:t xml:space="preserve">Beth Toenies</w:t>
+            </w:r>
+          </w:p>
+        </w:tc>
+        <w:tc>
+          <w:tcPr>
+            <w:tcW w:w="1900" w:type="dxa"/>
+            <w:shd w:val="clear" w:color="auto" w:fill="FFFFFF"/>
+          </w:tcPr>
+          <w:p>
+            <w:pPr>
+              <w:spacing w:before="40" w:after="40"/>
+            </w:pPr>
+            <w:r>
+              <w:rPr>
+                <w:sz w:val="18"/>
+              </w:rPr>
+              <w:t xml:space="preserve">VP Franchise Dev + COO 1-800-BOARDUP</w:t>
+            </w:r>
+          </w:p>
+        </w:tc>
+        <w:tc>
+          <w:tcPr>
+            <w:tcW w:w="1900" w:type="dxa"/>
+            <w:shd w:val="clear" w:color="auto" w:fill="FFFFFF"/>
+          </w:tcPr>
+          <w:p>
+            <w:pPr>
+              <w:spacing w:before="40" w:after="40"/>
+            </w:pPr>
+            <w:r>
+              <w:rPr>
+                <w:color w:val="185FA5"/>
+                <w:sz w:val="16"/>
+              </w:rPr>
+              <w:t xml:space="preserve">bethtoenies</w:t>
+            </w:r>
+          </w:p>
+        </w:tc>
+        <w:tc>
+          <w:tcPr>
+            <w:tcW w:w="1700" w:type="dxa"/>
+            <w:shd w:val="clear" w:color="auto" w:fill="FFFFFF"/>
+          </w:tcPr>
+          <w:p>
+            <w:pPr>
+              <w:spacing w:before="40" w:after="40"/>
+            </w:pPr>
+            <w:r>
+              <w:rPr>
+                <w:sz w:val="16"/>
+              </w:rPr>
+              <w:t xml:space="preserve">Asbury University ’06 (Journalism, varsity tennis, honors). Navy military spouse, Jacksonv</w:t>
+            </w:r>
+          </w:p>
+        </w:tc>
+        <w:tc>
+          <w:tcPr>
+            <w:tcW w:w="1800" w:type="dxa"/>
+            <w:shd w:val="clear" w:color="auto" w:fill="FFFFFF"/>
+          </w:tcPr>
+          <w:p>
+            <w:pPr>
+              <w:spacing w:before="40" w:after="40"/>
+            </w:pPr>
+            <w:r>
+              <w:rPr>
+                <w:i/>
+                <w:iCs/>
+                <w:sz w:val="16"/>
+              </w:rPr>
+              <w:t xml:space="preserve"/>
+            </w:r>
+          </w:p>
+        </w:tc>
+      </w:tr>
+      <w:tr>
+        <w:tc>
+          <w:tcPr>
+            <w:tcW w:w="1700" w:type="dxa"/>
+            <w:shd w:val="clear" w:color="auto" w:fill="FFFFFF"/>
+          </w:tcPr>
+          <w:p>
+            <w:pPr>
+              <w:spacing w:before="40" w:after="40"/>
+            </w:pPr>
+            <w:r>
+              <w:rPr>
+                <w:b/>
+                <w:bCs/>
+                <w:sz w:val="18"/>
+              </w:rPr>
+              <w:t xml:space="preserve">Tim Fagan</w:t>
+            </w:r>
+          </w:p>
+        </w:tc>
+        <w:tc>
+          <w:tcPr>
+            <w:tcW w:w="1900" w:type="dxa"/>
+            <w:shd w:val="clear" w:color="auto" w:fill="FFFFFF"/>
+          </w:tcPr>
+          <w:p>
+            <w:pPr>
+              <w:spacing w:before="40" w:after="40"/>
+            </w:pPr>
+            <w:r>
+              <w:rPr>
+                <w:sz w:val="18"/>
+              </w:rPr>
+              <w:t xml:space="preserve">President 1-800 WD + Blue Kangaroo</w:t>
+            </w:r>
+          </w:p>
+        </w:tc>
+        <w:tc>
+          <w:tcPr>
+            <w:tcW w:w="1900" w:type="dxa"/>
+            <w:shd w:val="clear" w:color="auto" w:fill="FFFFFF"/>
+          </w:tcPr>
+          <w:p>
+            <w:pPr>
+              <w:spacing w:before="40" w:after="40"/>
+            </w:pPr>
+            <w:r>
+              <w:rPr>
+                <w:color w:val="185FA5"/>
+                <w:sz w:val="16"/>
+              </w:rPr>
+              <w:t xml:space="preserve">timfagan-belfor</w:t>
+            </w:r>
+          </w:p>
+        </w:tc>
+        <w:tc>
+          <w:tcPr>
+            <w:tcW w:w="1700" w:type="dxa"/>
+            <w:shd w:val="clear" w:color="auto" w:fill="FFFFFF"/>
+          </w:tcPr>
+          <w:p>
+            <w:pPr>
+              <w:spacing w:before="40" w:after="40"/>
+            </w:pPr>
+            <w:r>
+              <w:rPr>
+                <w:sz w:val="16"/>
+              </w:rPr>
+              <w:t xml:space="preserve">—</w:t>
+            </w:r>
+          </w:p>
+        </w:tc>
+        <w:tc>
+          <w:tcPr>
+            <w:tcW w:w="1800" w:type="dxa"/>
+            <w:shd w:val="clear" w:color="auto" w:fill="FFFFFF"/>
+          </w:tcPr>
+          <w:p>
+            <w:pPr>
+              <w:spacing w:before="40" w:after="40"/>
+            </w:pPr>
+            <w:r>
+              <w:rPr>
+                <w:i/>
+                <w:iCs/>
+                <w:sz w:val="16"/>
+              </w:rPr>
+              <w:t xml:space="preserve"/>
+            </w:r>
+          </w:p>
+        </w:tc>
+      </w:tr>
+      <w:tr>
+        <w:tc>
+          <w:tcPr>
+            <w:tcW w:w="1700" w:type="dxa"/>
+            <w:shd w:val="clear" w:color="auto" w:fill="FFFFFF"/>
+          </w:tcPr>
+          <w:p>
+            <w:pPr>
+              <w:spacing w:before="40" w:after="40"/>
+            </w:pPr>
+            <w:r>
+              <w:rPr>
+                <w:b/>
+                <w:bCs/>
+                <w:sz w:val="18"/>
+              </w:rPr>
+              <w:t xml:space="preserve">Matt O’Rourke</w:t>
+            </w:r>
+          </w:p>
+        </w:tc>
+        <w:tc>
+          <w:tcPr>
+            <w:tcW w:w="1900" w:type="dxa"/>
+            <w:shd w:val="clear" w:color="auto" w:fill="FFFFFF"/>
+          </w:tcPr>
+          <w:p>
+            <w:pPr>
+              <w:spacing w:before="40" w:after="40"/>
+            </w:pPr>
+            <w:r>
+              <w:rPr>
+                <w:sz w:val="18"/>
+              </w:rPr>
+              <w:t xml:space="preserve">Z Plumberz Founder/Brand Pres</w:t>
+            </w:r>
+          </w:p>
+        </w:tc>
+        <w:tc>
+          <w:tcPr>
+            <w:tcW w:w="1900" w:type="dxa"/>
+            <w:shd w:val="clear" w:color="auto" w:fill="FFFFFF"/>
+          </w:tcPr>
+          <w:p>
+            <w:pPr>
+              <w:spacing w:before="40" w:after="40"/>
+            </w:pPr>
+            <w:r>
+              <w:rPr>
+                <w:color w:val="185FA5"/>
+                <w:sz w:val="16"/>
+              </w:rPr>
+              <w:t xml:space="preserve">matthew-o-rourke-a835459</w:t>
+            </w:r>
+          </w:p>
+        </w:tc>
+        <w:tc>
+          <w:tcPr>
+            <w:tcW w:w="1700" w:type="dxa"/>
+            <w:shd w:val="clear" w:color="auto" w:fill="FFFFFF"/>
+          </w:tcPr>
+          <w:p>
+            <w:pPr>
+              <w:spacing w:before="40" w:after="40"/>
+            </w:pPr>
+            <w:r>
+              <w:rPr>
+                <w:sz w:val="16"/>
+              </w:rPr>
+              <w:t xml:space="preserve">—</w:t>
+            </w:r>
+          </w:p>
+        </w:tc>
+        <w:tc>
+          <w:tcPr>
+            <w:tcW w:w="1800" w:type="dxa"/>
+            <w:shd w:val="clear" w:color="auto" w:fill="FFFFFF"/>
+          </w:tcPr>
+          <w:p>
+            <w:pPr>
+              <w:spacing w:before="40" w:after="40"/>
+            </w:pPr>
+            <w:r>
+              <w:rPr>
+                <w:i/>
+                <w:iCs/>
+                <w:sz w:val="16"/>
+              </w:rPr>
+              <w:t xml:space="preserve"/>
+            </w:r>
+          </w:p>
+        </w:tc>
+      </w:tr>
+      <w:tr>
+        <w:tc>
+          <w:tcPr>
+            <w:tcW w:w="1700" w:type="dxa"/>
+            <w:shd w:val="clear" w:color="auto" w:fill="D1FAE5"/>
+          </w:tcPr>
+          <w:p>
+            <w:pPr>
+              <w:spacing w:before="40" w:after="40"/>
+            </w:pPr>
+            <w:r>
+              <w:rPr>
+                <w:b/>
+                <w:bCs/>
+                <w:sz w:val="18"/>
+              </w:rPr>
+              <w:t xml:space="preserve">Aaron Rich</w:t>
+            </w:r>
+          </w:p>
+        </w:tc>
+        <w:tc>
+          <w:tcPr>
+            <w:tcW w:w="1900" w:type="dxa"/>
+            <w:shd w:val="clear" w:color="auto" w:fill="D1FAE5"/>
+          </w:tcPr>
+          <w:p>
+            <w:pPr>
+              <w:spacing w:before="40" w:after="40"/>
+            </w:pPr>
+            <w:r>
+              <w:rPr>
+                <w:sz w:val="18"/>
+              </w:rPr>
+              <w:t xml:space="preserve">BluSky CIO 2022</w:t>
+            </w:r>
+          </w:p>
+        </w:tc>
+        <w:tc>
+          <w:tcPr>
+            <w:tcW w:w="1900" w:type="dxa"/>
+            <w:shd w:val="clear" w:color="auto" w:fill="D1FAE5"/>
+          </w:tcPr>
+          <w:p>
+            <w:pPr>
+              <w:spacing w:before="40" w:after="40"/>
+            </w:pPr>
+            <w:r>
+              <w:rPr>
+                <w:color w:val="185FA5"/>
+                <w:sz w:val="16"/>
+              </w:rPr>
+              <w:t xml:space="preserve"/>
+            </w:r>
+          </w:p>
+        </w:tc>
+        <w:tc>
+          <w:tcPr>
+            <w:tcW w:w="1700" w:type="dxa"/>
+            <w:shd w:val="clear" w:color="auto" w:fill="D1FAE5"/>
+          </w:tcPr>
+          <w:p>
+            <w:pPr>
+              <w:spacing w:before="40" w:after="40"/>
+            </w:pPr>
+            <w:r>
+              <w:rPr>
+                <w:sz w:val="16"/>
+              </w:rPr>
+              <w:t xml:space="preserve">—</w:t>
+            </w:r>
+          </w:p>
+        </w:tc>
+        <w:tc>
+          <w:tcPr>
+            <w:tcW w:w="1800" w:type="dxa"/>
+            <w:shd w:val="clear" w:color="auto" w:fill="D1FAE5"/>
+          </w:tcPr>
+          <w:p>
+            <w:pPr>
+              <w:spacing w:before="40" w:after="40"/>
+            </w:pPr>
+            <w:r>
+              <w:rPr>
+                <w:i/>
+                <w:iCs/>
+                <w:sz w:val="16"/>
+              </w:rPr>
+              <w:t xml:space="preserve">Lives in Cary, NC .  I will try and work an angle to get to Arron.</w:t>
+            </w:r>
+          </w:p>
+        </w:tc>
+      </w:tr>
+      <w:tr>
+        <w:tc>
+          <w:tcPr>
+            <w:tcW w:w="1700" w:type="dxa"/>
+            <w:shd w:val="clear" w:color="auto" w:fill="FFFFFF"/>
+          </w:tcPr>
+          <w:p>
+            <w:pPr>
+              <w:spacing w:before="40" w:after="40"/>
+            </w:pPr>
+            <w:r>
+              <w:rPr>
+                <w:b/>
+                <w:bCs/>
+                <w:sz w:val="18"/>
+              </w:rPr>
+              <w:t xml:space="preserve">Mark Minasian</w:t>
+            </w:r>
+          </w:p>
+        </w:tc>
+        <w:tc>
+          <w:tcPr>
+            <w:tcW w:w="1900" w:type="dxa"/>
+            <w:shd w:val="clear" w:color="auto" w:fill="FFFFFF"/>
+          </w:tcPr>
+          <w:p>
+            <w:pPr>
+              <w:spacing w:before="40" w:after="40"/>
+            </w:pPr>
+            <w:r>
+              <w:rPr>
+                <w:sz w:val="18"/>
+              </w:rPr>
+              <w:t xml:space="preserve">BluSky CEO Sept 2025</w:t>
+            </w:r>
+          </w:p>
+        </w:tc>
+        <w:tc>
+          <w:tcPr>
+            <w:tcW w:w="1900" w:type="dxa"/>
+            <w:shd w:val="clear" w:color="auto" w:fill="FFFFFF"/>
+          </w:tcPr>
+          <w:p>
+            <w:pPr>
+              <w:spacing w:before="40" w:after="40"/>
+            </w:pPr>
+            <w:r>
+              <w:rPr>
+                <w:color w:val="185FA5"/>
+                <w:sz w:val="16"/>
+              </w:rPr>
+              <w:t xml:space="preserve"/>
+            </w:r>
+          </w:p>
+        </w:tc>
+        <w:tc>
+          <w:tcPr>
+            <w:tcW w:w="1700" w:type="dxa"/>
+            <w:shd w:val="clear" w:color="auto" w:fill="FFFFFF"/>
+          </w:tcPr>
+          <w:p>
+            <w:pPr>
+              <w:spacing w:before="40" w:after="40"/>
+            </w:pPr>
+            <w:r>
+              <w:rPr>
+                <w:sz w:val="16"/>
+              </w:rPr>
+              <w:t xml:space="preserve">—</w:t>
+            </w:r>
+          </w:p>
+        </w:tc>
+        <w:tc>
+          <w:tcPr>
+            <w:tcW w:w="1800" w:type="dxa"/>
+            <w:shd w:val="clear" w:color="auto" w:fill="FFFFFF"/>
+          </w:tcPr>
+          <w:p>
+            <w:pPr>
+              <w:spacing w:before="40" w:after="40"/>
+            </w:pPr>
+            <w:r>
+              <w:rPr>
+                <w:i/>
+                <w:iCs/>
+                <w:sz w:val="16"/>
+              </w:rPr>
+              <w:t xml:space="preserve"/>
+            </w:r>
+          </w:p>
+        </w:tc>
+      </w:tr>
+      <w:tr>
+        <w:tc>
+          <w:tcPr>
+            <w:tcW w:w="1700" w:type="dxa"/>
+            <w:shd w:val="clear" w:color="auto" w:fill="FFFFFF"/>
+          </w:tcPr>
+          <w:p>
+            <w:pPr>
+              <w:spacing w:before="40" w:after="40"/>
+            </w:pPr>
+            <w:r>
+              <w:rPr>
+                <w:b/>
+                <w:bCs/>
+                <w:sz w:val="18"/>
+              </w:rPr>
+              <w:t xml:space="preserve">Chris Jones</w:t>
+            </w:r>
+          </w:p>
+        </w:tc>
+        <w:tc>
+          <w:tcPr>
+            <w:tcW w:w="1900" w:type="dxa"/>
+            <w:shd w:val="clear" w:color="auto" w:fill="FFFFFF"/>
+          </w:tcPr>
+          <w:p>
+            <w:pPr>
+              <w:spacing w:before="40" w:after="40"/>
+            </w:pPr>
+            <w:r>
+              <w:rPr>
+                <w:sz w:val="18"/>
+              </w:rPr>
+              <w:t xml:space="preserve">CFO Holdings</w:t>
+            </w:r>
+          </w:p>
+        </w:tc>
+        <w:tc>
+          <w:tcPr>
+            <w:tcW w:w="1900" w:type="dxa"/>
+            <w:shd w:val="clear" w:color="auto" w:fill="FFFFFF"/>
+          </w:tcPr>
+          <w:p>
+            <w:pPr>
+              <w:spacing w:before="40" w:after="40"/>
+            </w:pPr>
+            <w:r>
+              <w:rPr>
+                <w:color w:val="185FA5"/>
+                <w:sz w:val="16"/>
+              </w:rPr>
+              <w:t xml:space="preserve"/>
+            </w:r>
+          </w:p>
+        </w:tc>
+        <w:tc>
+          <w:tcPr>
+            <w:tcW w:w="1700" w:type="dxa"/>
+            <w:shd w:val="clear" w:color="auto" w:fill="FFFFFF"/>
+          </w:tcPr>
+          <w:p>
+            <w:pPr>
+              <w:spacing w:before="40" w:after="40"/>
+            </w:pPr>
+            <w:r>
+              <w:rPr>
+                <w:sz w:val="16"/>
+              </w:rPr>
+              <w:t xml:space="preserve">24+ yrs Financial Mgmt, M&amp;A, Tax. Pending school.</w:t>
+            </w:r>
+          </w:p>
+        </w:tc>
+        <w:tc>
+          <w:tcPr>
+            <w:tcW w:w="1800" w:type="dxa"/>
+            <w:shd w:val="clear" w:color="auto" w:fill="FFFFFF"/>
+          </w:tcPr>
+          <w:p>
+            <w:pPr>
+              <w:spacing w:before="40" w:after="40"/>
+            </w:pPr>
+            <w:r>
+              <w:rPr>
+                <w:i/>
+                <w:iCs/>
+                <w:sz w:val="16"/>
+              </w:rPr>
+              <w:t xml:space="preserve"/>
+            </w:r>
+          </w:p>
         </w:tc>
       </w:tr>
     </w:tbl>
     <w:p>
       <w:pPr>
-        <w:spacing w:before="180" w:after="80"/>
+        <w:pStyle w:val="Heading1"/>
       </w:pPr>
       <w:r>
-        <w:rPr>
-          <w:b/>
-          <w:bCs/>
-          <w:color w:val="1A2B3C"/>
-          <w:sz w:val="22"/>
-          <w:szCs w:val="22"/>
-        </w:rPr>
-        <w:t>How I see this playing out</w:t>
+        <w:t xml:space="preserve">📞 Outreach plan &amp; sequencing — IN DEVELOPMENT</w:t>
       </w:r>
     </w:p>
+    <w:tbl>
+      <w:tblPr>
+        <w:tblW w:w="9000" w:type="dxa"/>
+        <w:tblBorders>
+          <w:top w:val="single" w:sz="4" w:space="0" w:color="D97706"/>
+          <w:left w:val="single" w:sz="4" w:space="0" w:color="D97706"/>
+          <w:bottom w:val="single" w:sz="4" w:space="0" w:color="D97706"/>
+          <w:right w:val="single" w:sz="4" w:space="0" w:color="D97706"/>
+        </w:tblBorders>
+      </w:tblPr>
+      <w:tblGrid>
+        <w:gridCol w:w="9000"/>
+      </w:tblGrid>
+      <w:tr>
+        <w:tc>
+          <w:tcPr>
+            <w:tcW w:w="9000" w:type="dxa"/>
+            <w:shd w:val="clear" w:color="auto" w:fill="FEF3C7"/>
+          </w:tcPr>
+          <w:p>
+            <w:pPr>
+              <w:spacing w:before="80" w:after="80"/>
+            </w:pPr>
+            <w:r>
+              <w:rPr>
+                <w:b/>
+                <w:bCs/>
+                <w:color w:val="92400E"/>
+              </w:rPr>
+              <w:t xml:space="preserve">Status: </w:t>
+            </w:r>
+            <w:r>
+              <w:t xml:space="preserve">Working with Becky (GPS Insight Marketing) on a coordinated warm marketing touch plan that sequences outreach against the contacts above using Alumni Crossover v19 warm anchors. Will populate as deliverables land. Live entries in Master CRM v15.36 Engagement Log (#79–83).</w:t>
+            </w:r>
+          </w:p>
+        </w:tc>
+      </w:tr>
+    </w:tbl>
     <w:p>
       <w:pPr>
-        <w:spacing w:after="100"/>
+        <w:spacing w:before="80" w:after="80"/>
       </w:pPr>
       <w:r>
         <w:rPr>
@@ -6232,79 +5938,44 @@
           <w:bCs/>
           <w:color w:val="1A2B3C"/>
         </w:rPr>
-        <w:t xml:space="preserve">Step 1. </w:t>
-      </w:r>
-      <w:r>
-        <w:rPr>
-          <w:color w:val="3A4A5C"/>
-        </w:rPr>
-        <w:t>Doug Smith warm-path activation — present existing 94% penetration data + V2 ranking. Frame as platform standardization VCI ahead of American Securities exit window.</w:t>
+        <w:t xml:space="preserve">Inputs needed from GPS Insight team:</w:t>
       </w:r>
     </w:p>
     <w:p>
       <w:pPr>
-        <w:spacing w:after="100"/>
+        <w:spacing w:before="40" w:after="40"/>
+        <w:ind w:left="360" w:hanging="360"/>
       </w:pPr>
       <w:r>
-        <w:rPr>
-          <w:b/>
-          <w:bCs/>
-          <w:color w:val="1A2B3C"/>
-        </w:rPr>
-        <w:t xml:space="preserve">Step 2. </w:t>
+        <w:t xml:space="preserve">• </w:t>
       </w:r>
       <w:r>
-        <w:rPr>
-          <w:color w:val="3A4A5C"/>
-        </w:rPr>
-        <w:t>Beth Toenies follow-up call to validate franchisee-level resonance — does franchise development team already champion ServiceBridge informally?</w:t>
+        <w:t xml:space="preserve">Alumni hits in column J of Alumni Crossover v19 (alma mater matches)</w:t>
       </w:r>
     </w:p>
     <w:p>
       <w:pPr>
-        <w:spacing w:after="100"/>
+        <w:spacing w:before="40" w:after="40"/>
+        <w:ind w:left="360" w:hanging="360"/>
       </w:pPr>
       <w:r>
-        <w:rPr>
-          <w:b/>
-          <w:bCs/>
-          <w:color w:val="1A2B3C"/>
-        </w:rPr>
-        <w:t xml:space="preserve">Step 3. </w:t>
+        <w:t xml:space="preserve">• </w:t>
       </w:r>
       <w:r>
-        <w:rPr>
-          <w:color w:val="3A4A5C"/>
-        </w:rPr>
-        <w:t>Rusty Amarante portfolio conversation — gated on Smith/Toenies alignment. Tone: this is conversion, not acquisition.</w:t>
+        <w:t xml:space="preserve">LinkedIn 1st-degree mutual connections — click each LinkedIn URL above</w:t>
       </w:r>
     </w:p>
     <w:p>
       <w:pPr>
-        <w:spacing w:after="100"/>
+        <w:spacing w:before="40" w:after="40"/>
+        <w:ind w:left="360" w:hanging="360"/>
       </w:pPr>
       <w:r>
-        <w:rPr>
-          <w:b/>
-          <w:bCs/>
-          <w:color w:val="1A2B3C"/>
-        </w:rPr>
-        <w:t xml:space="preserve">Step 4. </w:t>
+        <w:t xml:space="preserve">• </w:t>
       </w:r>
       <w:r>
-        <w:rPr>
-          <w:color w:val="3A4A5C"/>
-        </w:rPr>
-        <w:t>American Securities operating partner introduction (via GPSI team / CFO Garrett) — VCI math attached. This is the mandate-conversion conversation.</w:t>
+        <w:t xml:space="preserve">Verification of any flagged status changes before sequencing</w:t>
       </w:r>
-    </w:p>
-    <w:p>
-      <w:pPr>
-        <w:pBdr>
-          <w:bottom w:val="single" w:sz="6" w:space="1" w:color="185FA5"/>
-        </w:pBdr>
-        <w:spacing w:after="200"/>
-      </w:pPr>
     </w:p>
     <w:p>
       <w:pPr>
@@ -6380,11 +6051,6 @@
                 <w:color w:val="3A4A5C"/>
               </w:rPr>
               <w:t xml:space="preserve">Unlike P1 targets where ServiceTitan or other incumbents dominate, BELFOR has a relatively open landscape at the franchisor level — no single FSM mandate. ServiceBridge has won at the HOODZ/DUCTZ level organically. The competitive question for BELFOR is not "who else is selling FSM here" but "why </w:t>
-            </w:r>
-            <w:r>
-              <w:rPr>
-                <w:color w:val="3A4A5C"/>
-              </w:rPr>
               <w:lastRenderedPageBreak/>
               <w:t>hasn't BFG corporate moved to standardize." That's a strategic question, not a vendor selection question. The displacement narrative doesn't apply — this is a conversion narrative.</w:t>
             </w:r>
@@ -8198,1047 +7864,6 @@
             <w:vAlign w:val="center"/>
           </w:tcPr>
           <w:p/>
-        </w:tc>
-      </w:tr>
-    </w:tbl>
-    <w:p>
-      <w:pPr>
-        <w:pBdr>
-          <w:bottom w:val="single" w:sz="6" w:space="1" w:color="185FA5"/>
-        </w:pBdr>
-        <w:spacing w:after="200"/>
-      </w:pPr>
-    </w:p>
-    <w:p>
-      <w:pPr>
-        <w:spacing w:before="240" w:after="120"/>
-      </w:pPr>
-      <w:r>
-        <w:rPr>
-          <w:b/>
-          <w:bCs/>
-          <w:color w:val="1A2B3C"/>
-          <w:sz w:val="28"/>
-          <w:szCs w:val="28"/>
-        </w:rPr>
-        <w:t>🎯 Where Marketing teammates have unique line of sight</w:t>
-      </w:r>
-    </w:p>
-    <w:tbl>
-      <w:tblPr>
-        <w:tblW w:w="10080" w:type="dxa"/>
-        <w:tblBorders>
-          <w:top w:val="single" w:sz="6" w:space="0" w:color="E8D89C"/>
-          <w:left w:val="single" w:sz="6" w:space="0" w:color="E8D89C"/>
-          <w:bottom w:val="single" w:sz="6" w:space="0" w:color="E8D89C"/>
-          <w:right w:val="single" w:sz="6" w:space="0" w:color="E8D89C"/>
-          <w:insideH w:val="single" w:sz="4" w:space="0" w:color="auto"/>
-          <w:insideV w:val="single" w:sz="4" w:space="0" w:color="auto"/>
-        </w:tblBorders>
-        <w:tblCellMar>
-          <w:left w:w="10" w:type="dxa"/>
-          <w:right w:w="10" w:type="dxa"/>
-        </w:tblCellMar>
-        <w:tblLook w:val="0000" w:firstRow="0" w:lastRow="0" w:firstColumn="0" w:lastColumn="0" w:noHBand="0" w:noVBand="0"/>
-      </w:tblPr>
-      <w:tblGrid>
-        <w:gridCol w:w="10080"/>
-      </w:tblGrid>
-      <w:tr>
-        <w:tblPrEx>
-          <w:tblCellMar>
-            <w:top w:w="0" w:type="dxa"/>
-            <w:bottom w:w="0" w:type="dxa"/>
-          </w:tblCellMar>
-        </w:tblPrEx>
-        <w:tc>
-          <w:tcPr>
-            <w:tcW w:w="10080" w:type="dxa"/>
-            <w:shd w:val="clear" w:color="auto" w:fill="FBF4E0"/>
-            <w:tcMar>
-              <w:top w:w="200" w:type="dxa"/>
-              <w:left w:w="280" w:type="dxa"/>
-              <w:bottom w:w="200" w:type="dxa"/>
-              <w:right w:w="280" w:type="dxa"/>
-            </w:tcMar>
-          </w:tcPr>
-          <w:p>
-            <w:pPr>
-              <w:spacing w:after="100"/>
-            </w:pPr>
-            <w:r>
-              <w:rPr>
-                <w:b/>
-                <w:bCs/>
-                <w:color w:val="1A2B3C"/>
-                <w:sz w:val="22"/>
-                <w:szCs w:val="22"/>
-              </w:rPr>
-              <w:lastRenderedPageBreak/>
-              <w:t>How we move from where we are to where we want to be</w:t>
-            </w:r>
-          </w:p>
-          <w:p>
-            <w:r>
-              <w:rPr>
-                <w:color w:val="3A4A5C"/>
-              </w:rPr>
-              <w:t>My read on BELFOR Franchise Group: there are gaps that public research can't close — these are the ones where the team's tribal knowledge, existing relationships, and access to internal data unlock our biggest leaps. Listed here as collective gaps, not directives. Marketing teammates are best placed to move these forward.</w:t>
-            </w:r>
-          </w:p>
-        </w:tc>
-      </w:tr>
-    </w:tbl>
-    <w:p>
-      <w:pPr>
-        <w:spacing w:before="80" w:after="80"/>
-      </w:pPr>
-    </w:p>
-    <w:p>
-      <w:pPr>
-        <w:spacing w:after="120"/>
-      </w:pPr>
-      <w:r>
-        <w:rPr>
-          <w:color w:val="3A4A5C"/>
-        </w:rPr>
-        <w:t>A few things where Marketing teammates' tribal knowledge would help us move faster. We'll self-assign owners on the call.</w:t>
-      </w:r>
-    </w:p>
-    <w:tbl>
-      <w:tblPr>
-        <w:tblW w:w="10080" w:type="dxa"/>
-        <w:tblBorders>
-          <w:top w:val="single" w:sz="4" w:space="0" w:color="auto"/>
-          <w:left w:val="single" w:sz="4" w:space="0" w:color="auto"/>
-          <w:bottom w:val="single" w:sz="4" w:space="0" w:color="auto"/>
-          <w:right w:val="single" w:sz="4" w:space="0" w:color="auto"/>
-          <w:insideH w:val="single" w:sz="4" w:space="0" w:color="auto"/>
-          <w:insideV w:val="single" w:sz="4" w:space="0" w:color="auto"/>
-        </w:tblBorders>
-        <w:tblCellMar>
-          <w:left w:w="10" w:type="dxa"/>
-          <w:right w:w="10" w:type="dxa"/>
-        </w:tblCellMar>
-        <w:tblLook w:val="0000" w:firstRow="0" w:lastRow="0" w:firstColumn="0" w:lastColumn="0" w:noHBand="0" w:noVBand="0"/>
-      </w:tblPr>
-      <w:tblGrid>
-        <w:gridCol w:w="1200"/>
-        <w:gridCol w:w="4500"/>
-        <w:gridCol w:w="2400"/>
-        <w:gridCol w:w="1980"/>
-      </w:tblGrid>
-      <w:tr>
-        <w:tblPrEx>
-          <w:tblCellMar>
-            <w:top w:w="0" w:type="dxa"/>
-            <w:bottom w:w="0" w:type="dxa"/>
-          </w:tblCellMar>
-        </w:tblPrEx>
-        <w:trPr>
-          <w:tblHeader/>
-        </w:trPr>
-        <w:tc>
-          <w:tcPr>
-            <w:tcW w:w="1200" w:type="dxa"/>
-            <w:tcBorders>
-              <w:top w:val="single" w:sz="4" w:space="0" w:color="1A2B3C"/>
-              <w:left w:val="single" w:sz="4" w:space="0" w:color="1A2B3C"/>
-              <w:bottom w:val="single" w:sz="4" w:space="0" w:color="1A2B3C"/>
-              <w:right w:val="single" w:sz="4" w:space="0" w:color="1A2B3C"/>
-            </w:tcBorders>
-            <w:shd w:val="clear" w:color="auto" w:fill="1A2B3C"/>
-            <w:tcMar>
-              <w:top w:w="100" w:type="dxa"/>
-              <w:left w:w="120" w:type="dxa"/>
-              <w:bottom w:w="100" w:type="dxa"/>
-              <w:right w:w="120" w:type="dxa"/>
-            </w:tcMar>
-            <w:vAlign w:val="center"/>
-          </w:tcPr>
-          <w:p>
-            <w:r>
-              <w:rPr>
-                <w:b/>
-                <w:bCs/>
-                <w:color w:val="FFFFFF"/>
-                <w:spacing w:val="30"/>
-                <w:sz w:val="16"/>
-                <w:szCs w:val="16"/>
-              </w:rPr>
-              <w:t>Priority</w:t>
-            </w:r>
-          </w:p>
-        </w:tc>
-        <w:tc>
-          <w:tcPr>
-            <w:tcW w:w="4500" w:type="dxa"/>
-            <w:tcBorders>
-              <w:top w:val="single" w:sz="4" w:space="0" w:color="1A2B3C"/>
-              <w:left w:val="single" w:sz="4" w:space="0" w:color="1A2B3C"/>
-              <w:bottom w:val="single" w:sz="4" w:space="0" w:color="1A2B3C"/>
-              <w:right w:val="single" w:sz="4" w:space="0" w:color="1A2B3C"/>
-            </w:tcBorders>
-            <w:shd w:val="clear" w:color="auto" w:fill="1A2B3C"/>
-            <w:tcMar>
-              <w:top w:w="100" w:type="dxa"/>
-              <w:left w:w="120" w:type="dxa"/>
-              <w:bottom w:w="100" w:type="dxa"/>
-              <w:right w:w="120" w:type="dxa"/>
-            </w:tcMar>
-            <w:vAlign w:val="center"/>
-          </w:tcPr>
-          <w:p>
-            <w:r>
-              <w:rPr>
-                <w:b/>
-                <w:bCs/>
-                <w:color w:val="FFFFFF"/>
-                <w:spacing w:val="30"/>
-                <w:sz w:val="16"/>
-                <w:szCs w:val="16"/>
-              </w:rPr>
-              <w:t>What we need to validate</w:t>
-            </w:r>
-          </w:p>
-        </w:tc>
-        <w:tc>
-          <w:tcPr>
-            <w:tcW w:w="2400" w:type="dxa"/>
-            <w:tcBorders>
-              <w:top w:val="single" w:sz="4" w:space="0" w:color="1A2B3C"/>
-              <w:left w:val="single" w:sz="4" w:space="0" w:color="1A2B3C"/>
-              <w:bottom w:val="single" w:sz="4" w:space="0" w:color="1A2B3C"/>
-              <w:right w:val="single" w:sz="4" w:space="0" w:color="1A2B3C"/>
-            </w:tcBorders>
-            <w:shd w:val="clear" w:color="auto" w:fill="1A2B3C"/>
-            <w:tcMar>
-              <w:top w:w="100" w:type="dxa"/>
-              <w:left w:w="120" w:type="dxa"/>
-              <w:bottom w:w="100" w:type="dxa"/>
-              <w:right w:w="120" w:type="dxa"/>
-            </w:tcMar>
-            <w:vAlign w:val="center"/>
-          </w:tcPr>
-          <w:p>
-            <w:r>
-              <w:rPr>
-                <w:b/>
-                <w:bCs/>
-                <w:color w:val="FFFFFF"/>
-                <w:spacing w:val="30"/>
-                <w:sz w:val="16"/>
-                <w:szCs w:val="16"/>
-              </w:rPr>
-              <w:t>Current value/guess</w:t>
-            </w:r>
-          </w:p>
-        </w:tc>
-        <w:tc>
-          <w:tcPr>
-            <w:tcW w:w="1980" w:type="dxa"/>
-            <w:tcBorders>
-              <w:top w:val="single" w:sz="4" w:space="0" w:color="1A2B3C"/>
-              <w:left w:val="single" w:sz="4" w:space="0" w:color="1A2B3C"/>
-              <w:bottom w:val="single" w:sz="4" w:space="0" w:color="1A2B3C"/>
-              <w:right w:val="single" w:sz="4" w:space="0" w:color="1A2B3C"/>
-            </w:tcBorders>
-            <w:shd w:val="clear" w:color="auto" w:fill="1A2B3C"/>
-            <w:tcMar>
-              <w:top w:w="100" w:type="dxa"/>
-              <w:left w:w="120" w:type="dxa"/>
-              <w:bottom w:w="100" w:type="dxa"/>
-              <w:right w:w="120" w:type="dxa"/>
-            </w:tcMar>
-            <w:vAlign w:val="center"/>
-          </w:tcPr>
-          <w:p>
-            <w:r>
-              <w:rPr>
-                <w:b/>
-                <w:bCs/>
-                <w:color w:val="FFFFFF"/>
-                <w:spacing w:val="30"/>
-                <w:sz w:val="16"/>
-                <w:szCs w:val="16"/>
-              </w:rPr>
-              <w:t>Owner (assign on call)</w:t>
-            </w:r>
-          </w:p>
-        </w:tc>
-      </w:tr>
-      <w:tr>
-        <w:tblPrEx>
-          <w:tblCellMar>
-            <w:top w:w="0" w:type="dxa"/>
-            <w:bottom w:w="0" w:type="dxa"/>
-          </w:tblCellMar>
-        </w:tblPrEx>
-        <w:trPr>
-          <w:cantSplit/>
-        </w:trPr>
-        <w:tc>
-          <w:tcPr>
-            <w:tcW w:w="1200" w:type="dxa"/>
-            <w:tcBorders>
-              <w:top w:val="single" w:sz="4" w:space="0" w:color="D0D5DD"/>
-              <w:left w:val="single" w:sz="4" w:space="0" w:color="D0D5DD"/>
-              <w:bottom w:val="single" w:sz="4" w:space="0" w:color="D0D5DD"/>
-              <w:right w:val="single" w:sz="4" w:space="0" w:color="D0D5DD"/>
-            </w:tcBorders>
-            <w:shd w:val="clear" w:color="auto" w:fill="FFFFFF"/>
-            <w:tcMar>
-              <w:top w:w="100" w:type="dxa"/>
-              <w:left w:w="120" w:type="dxa"/>
-              <w:bottom w:w="100" w:type="dxa"/>
-              <w:right w:w="120" w:type="dxa"/>
-            </w:tcMar>
-            <w:vAlign w:val="center"/>
-          </w:tcPr>
-          <w:p>
-            <w:r>
-              <w:rPr>
-                <w:b/>
-                <w:bCs/>
-                <w:color w:val="C8501F"/>
-                <w:sz w:val="17"/>
-                <w:szCs w:val="17"/>
-              </w:rPr>
-              <w:t>HIGH</w:t>
-            </w:r>
-          </w:p>
-        </w:tc>
-        <w:tc>
-          <w:tcPr>
-            <w:tcW w:w="4500" w:type="dxa"/>
-            <w:tcBorders>
-              <w:top w:val="single" w:sz="4" w:space="0" w:color="D0D5DD"/>
-              <w:left w:val="single" w:sz="4" w:space="0" w:color="D0D5DD"/>
-              <w:bottom w:val="single" w:sz="4" w:space="0" w:color="D0D5DD"/>
-              <w:right w:val="single" w:sz="4" w:space="0" w:color="D0D5DD"/>
-            </w:tcBorders>
-            <w:shd w:val="clear" w:color="auto" w:fill="FFFFFF"/>
-            <w:tcMar>
-              <w:top w:w="100" w:type="dxa"/>
-              <w:left w:w="120" w:type="dxa"/>
-              <w:bottom w:w="100" w:type="dxa"/>
-              <w:right w:w="120" w:type="dxa"/>
-            </w:tcMar>
-            <w:vAlign w:val="center"/>
-          </w:tcPr>
-          <w:p>
-            <w:r>
-              <w:rPr>
-                <w:color w:val="3A4A5C"/>
-                <w:sz w:val="17"/>
-                <w:szCs w:val="17"/>
-              </w:rPr>
-              <w:t>Confirm Dan Tarantin departure status + replacement</w:t>
-            </w:r>
-          </w:p>
-        </w:tc>
-        <w:tc>
-          <w:tcPr>
-            <w:tcW w:w="2400" w:type="dxa"/>
-            <w:tcBorders>
-              <w:top w:val="single" w:sz="4" w:space="0" w:color="D0D5DD"/>
-              <w:left w:val="single" w:sz="4" w:space="0" w:color="D0D5DD"/>
-              <w:bottom w:val="single" w:sz="4" w:space="0" w:color="D0D5DD"/>
-              <w:right w:val="single" w:sz="4" w:space="0" w:color="D0D5DD"/>
-            </w:tcBorders>
-            <w:shd w:val="clear" w:color="auto" w:fill="FFFFFF"/>
-            <w:tcMar>
-              <w:top w:w="100" w:type="dxa"/>
-              <w:left w:w="120" w:type="dxa"/>
-              <w:bottom w:w="100" w:type="dxa"/>
-              <w:right w:w="120" w:type="dxa"/>
-            </w:tcMar>
-            <w:vAlign w:val="center"/>
-          </w:tcPr>
-          <w:p>
-            <w:r>
-              <w:rPr>
-                <w:color w:val="3A4A5C"/>
-                <w:sz w:val="17"/>
-                <w:szCs w:val="17"/>
-              </w:rPr>
-              <w:t>Reportedly left — verify</w:t>
-            </w:r>
-          </w:p>
-        </w:tc>
-        <w:tc>
-          <w:tcPr>
-            <w:tcW w:w="1980" w:type="dxa"/>
-            <w:tcBorders>
-              <w:top w:val="single" w:sz="4" w:space="0" w:color="D0D5DD"/>
-              <w:left w:val="single" w:sz="4" w:space="0" w:color="D0D5DD"/>
-              <w:bottom w:val="single" w:sz="4" w:space="0" w:color="D0D5DD"/>
-              <w:right w:val="single" w:sz="4" w:space="0" w:color="D0D5DD"/>
-            </w:tcBorders>
-            <w:shd w:val="clear" w:color="auto" w:fill="FFFFFF"/>
-            <w:tcMar>
-              <w:top w:w="100" w:type="dxa"/>
-              <w:left w:w="120" w:type="dxa"/>
-              <w:bottom w:w="100" w:type="dxa"/>
-              <w:right w:w="120" w:type="dxa"/>
-            </w:tcMar>
-            <w:vAlign w:val="center"/>
-          </w:tcPr>
-          <w:p>
-            <w:r>
-              <w:rPr>
-                <w:color w:val="6B7A8B"/>
-                <w:sz w:val="17"/>
-                <w:szCs w:val="17"/>
-              </w:rPr>
-              <w:t>Team</w:t>
-            </w:r>
-          </w:p>
-        </w:tc>
-      </w:tr>
-      <w:tr>
-        <w:tblPrEx>
-          <w:tblCellMar>
-            <w:top w:w="0" w:type="dxa"/>
-            <w:bottom w:w="0" w:type="dxa"/>
-          </w:tblCellMar>
-        </w:tblPrEx>
-        <w:trPr>
-          <w:cantSplit/>
-        </w:trPr>
-        <w:tc>
-          <w:tcPr>
-            <w:tcW w:w="1200" w:type="dxa"/>
-            <w:tcBorders>
-              <w:top w:val="single" w:sz="4" w:space="0" w:color="D0D5DD"/>
-              <w:left w:val="single" w:sz="4" w:space="0" w:color="D0D5DD"/>
-              <w:bottom w:val="single" w:sz="4" w:space="0" w:color="D0D5DD"/>
-              <w:right w:val="single" w:sz="4" w:space="0" w:color="D0D5DD"/>
-            </w:tcBorders>
-            <w:shd w:val="clear" w:color="auto" w:fill="F5F6F8"/>
-            <w:tcMar>
-              <w:top w:w="100" w:type="dxa"/>
-              <w:left w:w="120" w:type="dxa"/>
-              <w:bottom w:w="100" w:type="dxa"/>
-              <w:right w:w="120" w:type="dxa"/>
-            </w:tcMar>
-            <w:vAlign w:val="center"/>
-          </w:tcPr>
-          <w:p>
-            <w:r>
-              <w:rPr>
-                <w:b/>
-                <w:bCs/>
-                <w:color w:val="C8501F"/>
-                <w:sz w:val="17"/>
-                <w:szCs w:val="17"/>
-              </w:rPr>
-              <w:t>HIGH</w:t>
-            </w:r>
-          </w:p>
-        </w:tc>
-        <w:tc>
-          <w:tcPr>
-            <w:tcW w:w="4500" w:type="dxa"/>
-            <w:tcBorders>
-              <w:top w:val="single" w:sz="4" w:space="0" w:color="D0D5DD"/>
-              <w:left w:val="single" w:sz="4" w:space="0" w:color="D0D5DD"/>
-              <w:bottom w:val="single" w:sz="4" w:space="0" w:color="D0D5DD"/>
-              <w:right w:val="single" w:sz="4" w:space="0" w:color="D0D5DD"/>
-            </w:tcBorders>
-            <w:shd w:val="clear" w:color="auto" w:fill="F5F6F8"/>
-            <w:tcMar>
-              <w:top w:w="100" w:type="dxa"/>
-              <w:left w:w="120" w:type="dxa"/>
-              <w:bottom w:w="100" w:type="dxa"/>
-              <w:right w:w="120" w:type="dxa"/>
-            </w:tcMar>
-            <w:vAlign w:val="center"/>
-          </w:tcPr>
-          <w:p>
-            <w:r>
-              <w:rPr>
-                <w:color w:val="3A4A5C"/>
-                <w:sz w:val="17"/>
-                <w:szCs w:val="17"/>
-              </w:rPr>
-              <w:t>Establish American Securities operating partner contact</w:t>
-            </w:r>
-          </w:p>
-        </w:tc>
-        <w:tc>
-          <w:tcPr>
-            <w:tcW w:w="2400" w:type="dxa"/>
-            <w:tcBorders>
-              <w:top w:val="single" w:sz="4" w:space="0" w:color="D0D5DD"/>
-              <w:left w:val="single" w:sz="4" w:space="0" w:color="D0D5DD"/>
-              <w:bottom w:val="single" w:sz="4" w:space="0" w:color="D0D5DD"/>
-              <w:right w:val="single" w:sz="4" w:space="0" w:color="D0D5DD"/>
-            </w:tcBorders>
-            <w:shd w:val="clear" w:color="auto" w:fill="F5F6F8"/>
-            <w:tcMar>
-              <w:top w:w="100" w:type="dxa"/>
-              <w:left w:w="120" w:type="dxa"/>
-              <w:bottom w:w="100" w:type="dxa"/>
-              <w:right w:w="120" w:type="dxa"/>
-            </w:tcMar>
-            <w:vAlign w:val="center"/>
-          </w:tcPr>
-          <w:p>
-            <w:r>
-              <w:rPr>
-                <w:color w:val="3A4A5C"/>
-                <w:sz w:val="17"/>
-                <w:szCs w:val="17"/>
-              </w:rPr>
-              <w:t>TBD</w:t>
-            </w:r>
-          </w:p>
-        </w:tc>
-        <w:tc>
-          <w:tcPr>
-            <w:tcW w:w="1980" w:type="dxa"/>
-            <w:tcBorders>
-              <w:top w:val="single" w:sz="4" w:space="0" w:color="D0D5DD"/>
-              <w:left w:val="single" w:sz="4" w:space="0" w:color="D0D5DD"/>
-              <w:bottom w:val="single" w:sz="4" w:space="0" w:color="D0D5DD"/>
-              <w:right w:val="single" w:sz="4" w:space="0" w:color="D0D5DD"/>
-            </w:tcBorders>
-            <w:shd w:val="clear" w:color="auto" w:fill="F5F6F8"/>
-            <w:tcMar>
-              <w:top w:w="100" w:type="dxa"/>
-              <w:left w:w="120" w:type="dxa"/>
-              <w:bottom w:w="100" w:type="dxa"/>
-              <w:right w:w="120" w:type="dxa"/>
-            </w:tcMar>
-            <w:vAlign w:val="center"/>
-          </w:tcPr>
-          <w:p>
-            <w:r>
-              <w:rPr>
-                <w:color w:val="6B7A8B"/>
-                <w:sz w:val="17"/>
-                <w:szCs w:val="17"/>
-              </w:rPr>
-              <w:t>Team / Garrett</w:t>
-            </w:r>
-          </w:p>
-        </w:tc>
-      </w:tr>
-      <w:tr>
-        <w:tblPrEx>
-          <w:tblCellMar>
-            <w:top w:w="0" w:type="dxa"/>
-            <w:bottom w:w="0" w:type="dxa"/>
-          </w:tblCellMar>
-        </w:tblPrEx>
-        <w:trPr>
-          <w:cantSplit/>
-        </w:trPr>
-        <w:tc>
-          <w:tcPr>
-            <w:tcW w:w="1200" w:type="dxa"/>
-            <w:tcBorders>
-              <w:top w:val="single" w:sz="4" w:space="0" w:color="D0D5DD"/>
-              <w:left w:val="single" w:sz="4" w:space="0" w:color="D0D5DD"/>
-              <w:bottom w:val="single" w:sz="4" w:space="0" w:color="D0D5DD"/>
-              <w:right w:val="single" w:sz="4" w:space="0" w:color="D0D5DD"/>
-            </w:tcBorders>
-            <w:shd w:val="clear" w:color="auto" w:fill="FFFFFF"/>
-            <w:tcMar>
-              <w:top w:w="100" w:type="dxa"/>
-              <w:left w:w="120" w:type="dxa"/>
-              <w:bottom w:w="100" w:type="dxa"/>
-              <w:right w:w="120" w:type="dxa"/>
-            </w:tcMar>
-            <w:vAlign w:val="center"/>
-          </w:tcPr>
-          <w:p>
-            <w:r>
-              <w:rPr>
-                <w:b/>
-                <w:bCs/>
-                <w:color w:val="8A6D00"/>
-                <w:sz w:val="17"/>
-                <w:szCs w:val="17"/>
-              </w:rPr>
-              <w:t>MED</w:t>
-            </w:r>
-          </w:p>
-        </w:tc>
-        <w:tc>
-          <w:tcPr>
-            <w:tcW w:w="4500" w:type="dxa"/>
-            <w:tcBorders>
-              <w:top w:val="single" w:sz="4" w:space="0" w:color="D0D5DD"/>
-              <w:left w:val="single" w:sz="4" w:space="0" w:color="D0D5DD"/>
-              <w:bottom w:val="single" w:sz="4" w:space="0" w:color="D0D5DD"/>
-              <w:right w:val="single" w:sz="4" w:space="0" w:color="D0D5DD"/>
-            </w:tcBorders>
-            <w:shd w:val="clear" w:color="auto" w:fill="FFFFFF"/>
-            <w:tcMar>
-              <w:top w:w="100" w:type="dxa"/>
-              <w:left w:w="120" w:type="dxa"/>
-              <w:bottom w:w="100" w:type="dxa"/>
-              <w:right w:w="120" w:type="dxa"/>
-            </w:tcMar>
-            <w:vAlign w:val="center"/>
-          </w:tcPr>
-          <w:p>
-            <w:r>
-              <w:rPr>
-                <w:color w:val="3A4A5C"/>
-                <w:sz w:val="17"/>
-                <w:szCs w:val="17"/>
-              </w:rPr>
-              <w:t>Validate exact 94% penetration math (active vs licensed)</w:t>
-            </w:r>
-          </w:p>
-        </w:tc>
-        <w:tc>
-          <w:tcPr>
-            <w:tcW w:w="2400" w:type="dxa"/>
-            <w:tcBorders>
-              <w:top w:val="single" w:sz="4" w:space="0" w:color="D0D5DD"/>
-              <w:left w:val="single" w:sz="4" w:space="0" w:color="D0D5DD"/>
-              <w:bottom w:val="single" w:sz="4" w:space="0" w:color="D0D5DD"/>
-              <w:right w:val="single" w:sz="4" w:space="0" w:color="D0D5DD"/>
-            </w:tcBorders>
-            <w:shd w:val="clear" w:color="auto" w:fill="FFFFFF"/>
-            <w:tcMar>
-              <w:top w:w="100" w:type="dxa"/>
-              <w:left w:w="120" w:type="dxa"/>
-              <w:bottom w:w="100" w:type="dxa"/>
-              <w:right w:w="120" w:type="dxa"/>
-            </w:tcMar>
-            <w:vAlign w:val="center"/>
-          </w:tcPr>
-          <w:p>
-            <w:r>
-              <w:rPr>
-                <w:color w:val="3A4A5C"/>
-                <w:sz w:val="17"/>
-                <w:szCs w:val="17"/>
-              </w:rPr>
-              <w:t>Working figure</w:t>
-            </w:r>
-          </w:p>
-        </w:tc>
-        <w:tc>
-          <w:tcPr>
-            <w:tcW w:w="1980" w:type="dxa"/>
-            <w:tcBorders>
-              <w:top w:val="single" w:sz="4" w:space="0" w:color="D0D5DD"/>
-              <w:left w:val="single" w:sz="4" w:space="0" w:color="D0D5DD"/>
-              <w:bottom w:val="single" w:sz="4" w:space="0" w:color="D0D5DD"/>
-              <w:right w:val="single" w:sz="4" w:space="0" w:color="D0D5DD"/>
-            </w:tcBorders>
-            <w:shd w:val="clear" w:color="auto" w:fill="FFFFFF"/>
-            <w:tcMar>
-              <w:top w:w="100" w:type="dxa"/>
-              <w:left w:w="120" w:type="dxa"/>
-              <w:bottom w:w="100" w:type="dxa"/>
-              <w:right w:w="120" w:type="dxa"/>
-            </w:tcMar>
-            <w:vAlign w:val="center"/>
-          </w:tcPr>
-          <w:p>
-            <w:r>
-              <w:rPr>
-                <w:color w:val="6B7A8B"/>
-                <w:sz w:val="17"/>
-                <w:szCs w:val="17"/>
-              </w:rPr>
-              <w:t>Team</w:t>
-            </w:r>
-          </w:p>
-        </w:tc>
-      </w:tr>
-      <w:tr>
-        <w:tblPrEx>
-          <w:tblCellMar>
-            <w:top w:w="0" w:type="dxa"/>
-            <w:bottom w:w="0" w:type="dxa"/>
-          </w:tblCellMar>
-        </w:tblPrEx>
-        <w:trPr>
-          <w:cantSplit/>
-        </w:trPr>
-        <w:tc>
-          <w:tcPr>
-            <w:tcW w:w="1200" w:type="dxa"/>
-            <w:tcBorders>
-              <w:top w:val="single" w:sz="4" w:space="0" w:color="D0D5DD"/>
-              <w:left w:val="single" w:sz="4" w:space="0" w:color="D0D5DD"/>
-              <w:bottom w:val="single" w:sz="4" w:space="0" w:color="D0D5DD"/>
-              <w:right w:val="single" w:sz="4" w:space="0" w:color="D0D5DD"/>
-            </w:tcBorders>
-            <w:shd w:val="clear" w:color="auto" w:fill="F5F6F8"/>
-            <w:tcMar>
-              <w:top w:w="100" w:type="dxa"/>
-              <w:left w:w="120" w:type="dxa"/>
-              <w:bottom w:w="100" w:type="dxa"/>
-              <w:right w:w="120" w:type="dxa"/>
-            </w:tcMar>
-            <w:vAlign w:val="center"/>
-          </w:tcPr>
-          <w:p>
-            <w:r>
-              <w:rPr>
-                <w:b/>
-                <w:bCs/>
-                <w:color w:val="8A6D00"/>
-                <w:sz w:val="17"/>
-                <w:szCs w:val="17"/>
-              </w:rPr>
-              <w:t>MED</w:t>
-            </w:r>
-          </w:p>
-        </w:tc>
-        <w:tc>
-          <w:tcPr>
-            <w:tcW w:w="4500" w:type="dxa"/>
-            <w:tcBorders>
-              <w:top w:val="single" w:sz="4" w:space="0" w:color="D0D5DD"/>
-              <w:left w:val="single" w:sz="4" w:space="0" w:color="D0D5DD"/>
-              <w:bottom w:val="single" w:sz="4" w:space="0" w:color="D0D5DD"/>
-              <w:right w:val="single" w:sz="4" w:space="0" w:color="D0D5DD"/>
-            </w:tcBorders>
-            <w:shd w:val="clear" w:color="auto" w:fill="F5F6F8"/>
-            <w:tcMar>
-              <w:top w:w="100" w:type="dxa"/>
-              <w:left w:w="120" w:type="dxa"/>
-              <w:bottom w:w="100" w:type="dxa"/>
-              <w:right w:w="120" w:type="dxa"/>
-            </w:tcMar>
-            <w:vAlign w:val="center"/>
-          </w:tcPr>
-          <w:p>
-            <w:r>
-              <w:rPr>
-                <w:color w:val="3A4A5C"/>
-                <w:sz w:val="17"/>
-                <w:szCs w:val="17"/>
-              </w:rPr>
-              <w:t>Map FSM landscape across non-HOODZ/DUCTZ BFG brands</w:t>
-            </w:r>
-          </w:p>
-        </w:tc>
-        <w:tc>
-          <w:tcPr>
-            <w:tcW w:w="2400" w:type="dxa"/>
-            <w:tcBorders>
-              <w:top w:val="single" w:sz="4" w:space="0" w:color="D0D5DD"/>
-              <w:left w:val="single" w:sz="4" w:space="0" w:color="D0D5DD"/>
-              <w:bottom w:val="single" w:sz="4" w:space="0" w:color="D0D5DD"/>
-              <w:right w:val="single" w:sz="4" w:space="0" w:color="D0D5DD"/>
-            </w:tcBorders>
-            <w:shd w:val="clear" w:color="auto" w:fill="F5F6F8"/>
-            <w:tcMar>
-              <w:top w:w="100" w:type="dxa"/>
-              <w:left w:w="120" w:type="dxa"/>
-              <w:bottom w:w="100" w:type="dxa"/>
-              <w:right w:w="120" w:type="dxa"/>
-            </w:tcMar>
-            <w:vAlign w:val="center"/>
-          </w:tcPr>
-          <w:p>
-            <w:r>
-              <w:rPr>
-                <w:color w:val="3A4A5C"/>
-                <w:sz w:val="17"/>
-                <w:szCs w:val="17"/>
-              </w:rPr>
-              <w:t>Mixed</w:t>
-            </w:r>
-          </w:p>
-        </w:tc>
-        <w:tc>
-          <w:tcPr>
-            <w:tcW w:w="1980" w:type="dxa"/>
-            <w:tcBorders>
-              <w:top w:val="single" w:sz="4" w:space="0" w:color="D0D5DD"/>
-              <w:left w:val="single" w:sz="4" w:space="0" w:color="D0D5DD"/>
-              <w:bottom w:val="single" w:sz="4" w:space="0" w:color="D0D5DD"/>
-              <w:right w:val="single" w:sz="4" w:space="0" w:color="D0D5DD"/>
-            </w:tcBorders>
-            <w:shd w:val="clear" w:color="auto" w:fill="F5F6F8"/>
-            <w:tcMar>
-              <w:top w:w="100" w:type="dxa"/>
-              <w:left w:w="120" w:type="dxa"/>
-              <w:bottom w:w="100" w:type="dxa"/>
-              <w:right w:w="120" w:type="dxa"/>
-            </w:tcMar>
-            <w:vAlign w:val="center"/>
-          </w:tcPr>
-          <w:p>
-            <w:r>
-              <w:rPr>
-                <w:color w:val="6B7A8B"/>
-                <w:sz w:val="17"/>
-                <w:szCs w:val="17"/>
-              </w:rPr>
-              <w:t>Team</w:t>
-            </w:r>
-          </w:p>
-        </w:tc>
-      </w:tr>
-      <w:tr>
-        <w:tblPrEx>
-          <w:tblCellMar>
-            <w:top w:w="0" w:type="dxa"/>
-            <w:bottom w:w="0" w:type="dxa"/>
-          </w:tblCellMar>
-        </w:tblPrEx>
-        <w:trPr>
-          <w:cantSplit/>
-        </w:trPr>
-        <w:tc>
-          <w:tcPr>
-            <w:tcW w:w="1200" w:type="dxa"/>
-            <w:tcBorders>
-              <w:top w:val="single" w:sz="4" w:space="0" w:color="D0D5DD"/>
-              <w:left w:val="single" w:sz="4" w:space="0" w:color="D0D5DD"/>
-              <w:bottom w:val="single" w:sz="4" w:space="0" w:color="D0D5DD"/>
-              <w:right w:val="single" w:sz="4" w:space="0" w:color="D0D5DD"/>
-            </w:tcBorders>
-            <w:shd w:val="clear" w:color="auto" w:fill="FFFFFF"/>
-            <w:tcMar>
-              <w:top w:w="100" w:type="dxa"/>
-              <w:left w:w="120" w:type="dxa"/>
-              <w:bottom w:w="100" w:type="dxa"/>
-              <w:right w:w="120" w:type="dxa"/>
-            </w:tcMar>
-            <w:vAlign w:val="center"/>
-          </w:tcPr>
-          <w:p>
-            <w:r>
-              <w:rPr>
-                <w:b/>
-                <w:bCs/>
-                <w:color w:val="8A6D00"/>
-                <w:sz w:val="17"/>
-                <w:szCs w:val="17"/>
-              </w:rPr>
-              <w:t>MED</w:t>
-            </w:r>
-          </w:p>
-        </w:tc>
-        <w:tc>
-          <w:tcPr>
-            <w:tcW w:w="4500" w:type="dxa"/>
-            <w:tcBorders>
-              <w:top w:val="single" w:sz="4" w:space="0" w:color="D0D5DD"/>
-              <w:left w:val="single" w:sz="4" w:space="0" w:color="D0D5DD"/>
-              <w:bottom w:val="single" w:sz="4" w:space="0" w:color="D0D5DD"/>
-              <w:right w:val="single" w:sz="4" w:space="0" w:color="D0D5DD"/>
-            </w:tcBorders>
-            <w:shd w:val="clear" w:color="auto" w:fill="FFFFFF"/>
-            <w:tcMar>
-              <w:top w:w="100" w:type="dxa"/>
-              <w:left w:w="120" w:type="dxa"/>
-              <w:bottom w:w="100" w:type="dxa"/>
-              <w:right w:w="120" w:type="dxa"/>
-            </w:tcMar>
-            <w:vAlign w:val="center"/>
-          </w:tcPr>
-          <w:p>
-            <w:r>
-              <w:rPr>
-                <w:color w:val="3A4A5C"/>
-                <w:sz w:val="17"/>
-                <w:szCs w:val="17"/>
-              </w:rPr>
-              <w:t>Doug Smith + Beth Toenies relationship history with GPSI</w:t>
-            </w:r>
-          </w:p>
-        </w:tc>
-        <w:tc>
-          <w:tcPr>
-            <w:tcW w:w="2400" w:type="dxa"/>
-            <w:tcBorders>
-              <w:top w:val="single" w:sz="4" w:space="0" w:color="D0D5DD"/>
-              <w:left w:val="single" w:sz="4" w:space="0" w:color="D0D5DD"/>
-              <w:bottom w:val="single" w:sz="4" w:space="0" w:color="D0D5DD"/>
-              <w:right w:val="single" w:sz="4" w:space="0" w:color="D0D5DD"/>
-            </w:tcBorders>
-            <w:shd w:val="clear" w:color="auto" w:fill="FFFFFF"/>
-            <w:tcMar>
-              <w:top w:w="100" w:type="dxa"/>
-              <w:left w:w="120" w:type="dxa"/>
-              <w:bottom w:w="100" w:type="dxa"/>
-              <w:right w:w="120" w:type="dxa"/>
-            </w:tcMar>
-            <w:vAlign w:val="center"/>
-          </w:tcPr>
-          <w:p>
-            <w:r>
-              <w:rPr>
-                <w:color w:val="3A4A5C"/>
-                <w:sz w:val="17"/>
-                <w:szCs w:val="17"/>
-              </w:rPr>
-              <w:t>TBD</w:t>
-            </w:r>
-          </w:p>
-        </w:tc>
-        <w:tc>
-          <w:tcPr>
-            <w:tcW w:w="1980" w:type="dxa"/>
-            <w:tcBorders>
-              <w:top w:val="single" w:sz="4" w:space="0" w:color="D0D5DD"/>
-              <w:left w:val="single" w:sz="4" w:space="0" w:color="D0D5DD"/>
-              <w:bottom w:val="single" w:sz="4" w:space="0" w:color="D0D5DD"/>
-              <w:right w:val="single" w:sz="4" w:space="0" w:color="D0D5DD"/>
-            </w:tcBorders>
-            <w:shd w:val="clear" w:color="auto" w:fill="FFFFFF"/>
-            <w:tcMar>
-              <w:top w:w="100" w:type="dxa"/>
-              <w:left w:w="120" w:type="dxa"/>
-              <w:bottom w:w="100" w:type="dxa"/>
-              <w:right w:w="120" w:type="dxa"/>
-            </w:tcMar>
-            <w:vAlign w:val="center"/>
-          </w:tcPr>
-          <w:p>
-            <w:r>
-              <w:rPr>
-                <w:color w:val="6B7A8B"/>
-                <w:sz w:val="17"/>
-                <w:szCs w:val="17"/>
-              </w:rPr>
-              <w:t>Team</w:t>
-            </w:r>
-          </w:p>
-        </w:tc>
-      </w:tr>
-      <w:tr>
-        <w:tblPrEx>
-          <w:tblCellMar>
-            <w:top w:w="0" w:type="dxa"/>
-            <w:bottom w:w="0" w:type="dxa"/>
-          </w:tblCellMar>
-        </w:tblPrEx>
-        <w:trPr>
-          <w:cantSplit/>
-        </w:trPr>
-        <w:tc>
-          <w:tcPr>
-            <w:tcW w:w="1200" w:type="dxa"/>
-            <w:tcBorders>
-              <w:top w:val="single" w:sz="4" w:space="0" w:color="D0D5DD"/>
-              <w:left w:val="single" w:sz="4" w:space="0" w:color="D0D5DD"/>
-              <w:bottom w:val="single" w:sz="4" w:space="0" w:color="D0D5DD"/>
-              <w:right w:val="single" w:sz="4" w:space="0" w:color="D0D5DD"/>
-            </w:tcBorders>
-            <w:shd w:val="clear" w:color="auto" w:fill="F5F6F8"/>
-            <w:tcMar>
-              <w:top w:w="100" w:type="dxa"/>
-              <w:left w:w="120" w:type="dxa"/>
-              <w:bottom w:w="100" w:type="dxa"/>
-              <w:right w:w="120" w:type="dxa"/>
-            </w:tcMar>
-            <w:vAlign w:val="center"/>
-          </w:tcPr>
-          <w:p>
-            <w:r>
-              <w:rPr>
-                <w:b/>
-                <w:bCs/>
-                <w:color w:val="3A4A5C"/>
-                <w:sz w:val="17"/>
-                <w:szCs w:val="17"/>
-              </w:rPr>
-              <w:t>LOW</w:t>
-            </w:r>
-          </w:p>
-        </w:tc>
-        <w:tc>
-          <w:tcPr>
-            <w:tcW w:w="4500" w:type="dxa"/>
-            <w:tcBorders>
-              <w:top w:val="single" w:sz="4" w:space="0" w:color="D0D5DD"/>
-              <w:left w:val="single" w:sz="4" w:space="0" w:color="D0D5DD"/>
-              <w:bottom w:val="single" w:sz="4" w:space="0" w:color="D0D5DD"/>
-              <w:right w:val="single" w:sz="4" w:space="0" w:color="D0D5DD"/>
-            </w:tcBorders>
-            <w:shd w:val="clear" w:color="auto" w:fill="F5F6F8"/>
-            <w:tcMar>
-              <w:top w:w="100" w:type="dxa"/>
-              <w:left w:w="120" w:type="dxa"/>
-              <w:bottom w:w="100" w:type="dxa"/>
-              <w:right w:w="120" w:type="dxa"/>
-            </w:tcMar>
-            <w:vAlign w:val="center"/>
-          </w:tcPr>
-          <w:p>
-            <w:r>
-              <w:rPr>
-                <w:color w:val="3A4A5C"/>
-                <w:sz w:val="17"/>
-                <w:szCs w:val="17"/>
-              </w:rPr>
-              <w:t>American Securities exit timeline signals</w:t>
-            </w:r>
-          </w:p>
-        </w:tc>
-        <w:tc>
-          <w:tcPr>
-            <w:tcW w:w="2400" w:type="dxa"/>
-            <w:tcBorders>
-              <w:top w:val="single" w:sz="4" w:space="0" w:color="D0D5DD"/>
-              <w:left w:val="single" w:sz="4" w:space="0" w:color="D0D5DD"/>
-              <w:bottom w:val="single" w:sz="4" w:space="0" w:color="D0D5DD"/>
-              <w:right w:val="single" w:sz="4" w:space="0" w:color="D0D5DD"/>
-            </w:tcBorders>
-            <w:shd w:val="clear" w:color="auto" w:fill="F5F6F8"/>
-            <w:tcMar>
-              <w:top w:w="100" w:type="dxa"/>
-              <w:left w:w="120" w:type="dxa"/>
-              <w:bottom w:w="100" w:type="dxa"/>
-              <w:right w:w="120" w:type="dxa"/>
-            </w:tcMar>
-            <w:vAlign w:val="center"/>
-          </w:tcPr>
-          <w:p>
-            <w:r>
-              <w:rPr>
-                <w:color w:val="3A4A5C"/>
-                <w:sz w:val="17"/>
-                <w:szCs w:val="17"/>
-              </w:rPr>
-              <w:t>Year 6 — exit window opens</w:t>
-            </w:r>
-          </w:p>
-        </w:tc>
-        <w:tc>
-          <w:tcPr>
-            <w:tcW w:w="1980" w:type="dxa"/>
-            <w:tcBorders>
-              <w:top w:val="single" w:sz="4" w:space="0" w:color="D0D5DD"/>
-              <w:left w:val="single" w:sz="4" w:space="0" w:color="D0D5DD"/>
-              <w:bottom w:val="single" w:sz="4" w:space="0" w:color="D0D5DD"/>
-              <w:right w:val="single" w:sz="4" w:space="0" w:color="D0D5DD"/>
-            </w:tcBorders>
-            <w:shd w:val="clear" w:color="auto" w:fill="F5F6F8"/>
-            <w:tcMar>
-              <w:top w:w="100" w:type="dxa"/>
-              <w:left w:w="120" w:type="dxa"/>
-              <w:bottom w:w="100" w:type="dxa"/>
-              <w:right w:w="120" w:type="dxa"/>
-            </w:tcMar>
-            <w:vAlign w:val="center"/>
-          </w:tcPr>
-          <w:p>
-            <w:r>
-              <w:rPr>
-                <w:color w:val="6B7A8B"/>
-                <w:sz w:val="17"/>
-                <w:szCs w:val="17"/>
-              </w:rPr>
-              <w:t>Team / Garrett</w:t>
-            </w:r>
-          </w:p>
         </w:tc>
       </w:tr>
     </w:tbl>

</xml_diff>

<commit_message>
new t1 P1 readiness packages
</commit_message>
<xml_diff>
--- a/docs/BELFOR_Readiness_Execution.docx
+++ b/docs/BELFOR_Readiness_Execution.docx
@@ -5947,10 +5947,7 @@
         <w:ind w:left="360" w:hanging="360"/>
       </w:pPr>
       <w:r>
-        <w:t xml:space="preserve">• </w:t>
-      </w:r>
-      <w:r>
-        <w:t xml:space="preserve">Alumni hits in column J of Alumni Crossover v19 (alma mater matches)</w:t>
+        <w:t>• Alumni hits in column J of Alumni Crossover v19 (alma mater matches)</w:t>
       </w:r>
     </w:p>
     <w:p>
@@ -5959,10 +5956,7 @@
         <w:ind w:left="360" w:hanging="360"/>
       </w:pPr>
       <w:r>
-        <w:t xml:space="preserve">• </w:t>
-      </w:r>
-      <w:r>
-        <w:t xml:space="preserve">LinkedIn 1st-degree mutual connections — click each LinkedIn URL above</w:t>
+        <w:t>• LinkedIn 1st-degree mutual connections — click each LinkedIn URL above</w:t>
       </w:r>
     </w:p>
     <w:p>
@@ -5971,10 +5965,7 @@
         <w:ind w:left="360" w:hanging="360"/>
       </w:pPr>
       <w:r>
-        <w:t xml:space="preserve">• </w:t>
-      </w:r>
-      <w:r>
-        <w:t xml:space="preserve">Verification of any flagged status changes before sequencing</w:t>
+        <w:t>• Verification of any flagged status changes before sequencing</w:t>
       </w:r>
     </w:p>
     <w:p>
@@ -9434,7 +9425,7 @@
           <w:sz w:val="16"/>
           <w:szCs w:val="16"/>
         </w:rPr>
-        <w:t>Velocity GTM Co LLC  ·  BELFOR Franchise Group GTM Engagement Readiness  ·  April 28, 2026</w:t>
+        <w:t>Velocity GTM Co LLC  ·  BELFOR Franchise Group GTM Engagement Readiness  ·  May 4, 2026</w:t>
       </w:r>
     </w:p>
     <w:sectPr>
@@ -9480,7 +9471,7 @@
         <w:sz w:val="16"/>
         <w:szCs w:val="16"/>
       </w:rPr>
-      <w:t xml:space="preserve">Velocity GTM Co LLC  ·  April 28, 2026  ·  Page </w:t>
+      <w:t xml:space="preserve">Velocity GTM Co LLC  ·  May 4, 2026  ·  Page </w:t>
     </w:r>
     <w:r>
       <w:rPr>

</xml_diff>